<commit_message>
Module theo dõi tiến độ: ma trận tiến độ realtime theo từng phần bài, trạng thái đang mở bài
</commit_message>
<xml_diff>
--- a/docx/04-erd.docx
+++ b/docx/04-erd.docx
@@ -1313,7 +1313,225 @@
               <w:rPr>
                 <w:rStyle w:val="VerbatimChar"/>
               </w:rPr>
-              <w:t xml:space="preserve">V9__…</w:t>
+              <w:t xml:space="preserve">V9__inline_comment_kind.sql</w:t>
+            </w:r>
+          </w:p>
+        </w:tc>
+        <w:tc>
+          <w:tcPr/>
+          <w:p>
+            <w:pPr>
+              <w:pStyle w:val="Compact"/>
+            </w:pPr>
+            <w:r>
+              <w:t xml:space="preserve">Mức 2 / F5b</w:t>
+            </w:r>
+          </w:p>
+        </w:tc>
+        <w:tc>
+          <w:tcPr/>
+          <w:p>
+            <w:pPr>
+              <w:pStyle w:val="Compact"/>
+            </w:pPr>
+            <w:r>
+              <w:rPr>
+                <w:rStyle w:val="VerbatimChar"/>
+              </w:rPr>
+              <w:t xml:space="preserve">inline_comments.kind</w:t>
+            </w:r>
+            <w:r>
+              <w:t xml:space="preserve"> </w:t>
+            </w:r>
+            <w:r>
+              <w:t xml:space="preserve">(lỗi / lưu ý / dùng hay),</w:t>
+            </w:r>
+            <w:r>
+              <w:t xml:space="preserve"> </w:t>
+            </w:r>
+            <w:r>
+              <w:rPr>
+                <w:rStyle w:val="VerbatimChar"/>
+              </w:rPr>
+              <w:t xml:space="preserve">inline_comments.resolution</w:t>
+            </w:r>
+            <w:r>
+              <w:t xml:space="preserve"> </w:t>
+            </w:r>
+            <w:r>
+              <w:t xml:space="preserve">(đánh giá đã sửa khi so sánh 2 lần nộp); nới CK</w:t>
+            </w:r>
+            <w:r>
+              <w:t xml:space="preserve"> </w:t>
+            </w:r>
+            <w:r>
+              <w:rPr>
+                <w:rStyle w:val="VerbatimChar"/>
+              </w:rPr>
+              <w:t xml:space="preserve">chk_inline_has_content</w:t>
+            </w:r>
+            <w:r>
+              <w:t xml:space="preserve"> </w:t>
+            </w:r>
+            <w:r>
+              <w:t xml:space="preserve">cho lưu ý / dùng hay; thêm mã hệ thống</w:t>
+            </w:r>
+            <w:r>
+              <w:t xml:space="preserve"> </w:t>
+            </w:r>
+            <w:r>
+              <w:rPr>
+                <w:rStyle w:val="VerbatimChar"/>
+              </w:rPr>
+              <w:t xml:space="preserve">GR</w:t>
+            </w:r>
+            <w:r>
+              <w:t xml:space="preserve">,</w:t>
+            </w:r>
+            <w:r>
+              <w:t xml:space="preserve"> </w:t>
+            </w:r>
+            <w:r>
+              <w:rPr>
+                <w:rStyle w:val="VerbatimChar"/>
+              </w:rPr>
+              <w:t xml:space="preserve">OTHER</w:t>
+            </w:r>
+          </w:p>
+        </w:tc>
+        <w:tc>
+          <w:tcPr/>
+          <w:p>
+            <w:pPr>
+              <w:pStyle w:val="Compact"/>
+            </w:pPr>
+            <w:r>
+              <w:t xml:space="preserve">✅ đã viết</w:t>
+            </w:r>
+          </w:p>
+        </w:tc>
+      </w:tr>
+      <w:tr>
+        <w:tc>
+          <w:tcPr/>
+          <w:p>
+            <w:pPr>
+              <w:pStyle w:val="Compact"/>
+            </w:pPr>
+            <w:r>
+              <w:rPr>
+                <w:rStyle w:val="VerbatimChar"/>
+              </w:rPr>
+              <w:t xml:space="preserve">V10__inline_comment_edit.sql</w:t>
+            </w:r>
+          </w:p>
+        </w:tc>
+        <w:tc>
+          <w:tcPr/>
+          <w:p>
+            <w:pPr>
+              <w:pStyle w:val="Compact"/>
+            </w:pPr>
+            <w:r>
+              <w:t xml:space="preserve">Mức 2 / F5b</w:t>
+            </w:r>
+          </w:p>
+        </w:tc>
+        <w:tc>
+          <w:tcPr/>
+          <w:p>
+            <w:pPr>
+              <w:pStyle w:val="Compact"/>
+            </w:pPr>
+            <w:r>
+              <w:rPr>
+                <w:rStyle w:val="VerbatimChar"/>
+              </w:rPr>
+              <w:t xml:space="preserve">inline_comments.edit</w:t>
+            </w:r>
+            <w:r>
+              <w:t xml:space="preserve"> </w:t>
+            </w:r>
+            <w:r>
+              <w:t xml:space="preserve">(REPLACE / DELETE / INSERT — sửa kiểu track changes),</w:t>
+            </w:r>
+            <w:r>
+              <w:t xml:space="preserve"> </w:t>
+            </w:r>
+            <w:r>
+              <w:rPr>
+                <w:rStyle w:val="VerbatimChar"/>
+              </w:rPr>
+              <w:t xml:space="preserve">kind</w:t>
+            </w:r>
+            <w:r>
+              <w:t xml:space="preserve"> </w:t>
+            </w:r>
+            <w:r>
+              <w:t xml:space="preserve">thêm</w:t>
+            </w:r>
+            <w:r>
+              <w:t xml:space="preserve"> </w:t>
+            </w:r>
+            <w:r>
+              <w:rPr>
+                <w:rStyle w:val="VerbatimChar"/>
+              </w:rPr>
+              <w:t xml:space="preserve">COMMENT</w:t>
+            </w:r>
+            <w:r>
+              <w:t xml:space="preserve">; CK</w:t>
+            </w:r>
+            <w:r>
+              <w:t xml:space="preserve"> </w:t>
+            </w:r>
+            <w:r>
+              <w:rPr>
+                <w:rStyle w:val="VerbatimChar"/>
+              </w:rPr>
+              <w:t xml:space="preserve">chk_inline_has_content</w:t>
+            </w:r>
+            <w:r>
+              <w:t xml:space="preserve"> </w:t>
+            </w:r>
+            <w:r>
+              <w:t xml:space="preserve">tính cả</w:t>
+            </w:r>
+            <w:r>
+              <w:t xml:space="preserve"> </w:t>
+            </w:r>
+            <w:r>
+              <w:rPr>
+                <w:rStyle w:val="VerbatimChar"/>
+              </w:rPr>
+              <w:t xml:space="preserve">edit</w:t>
+            </w:r>
+          </w:p>
+        </w:tc>
+        <w:tc>
+          <w:tcPr/>
+          <w:p>
+            <w:pPr>
+              <w:pStyle w:val="Compact"/>
+            </w:pPr>
+            <w:r>
+              <w:t xml:space="preserve">✅ đã viết</w:t>
+            </w:r>
+          </w:p>
+        </w:tc>
+      </w:tr>
+      <w:tr>
+        <w:tc>
+          <w:tcPr/>
+          <w:p>
+            <w:pPr>
+              <w:pStyle w:val="Compact"/>
+            </w:pPr>
+            <w:r>
+              <w:rPr>
+                <w:rStyle w:val="VerbatimChar"/>
+              </w:rPr>
+              <w:t xml:space="preserve">V11__…</w:t>
             </w:r>
             <w:r>
               <w:t xml:space="preserve"> </w:t>
@@ -1384,7 +1602,7 @@
         <w:pStyle w:val="BlockText"/>
       </w:pPr>
       <w:r>
-        <w:t xml:space="preserve">Lộ trình đã đánh số lại sau khi nghiên cứu nghiệp vụ chấm IELTS (tài liệu 08). Ở bước 12, migration Mức 2 (trước gộp trong V6) được tách theo từng bước — V6 audit, V7 chat, V8 bản nháp — để mỗi bước tự chứa bảng và entity của mình; Mức 3 dời sang V9 trở đi. Mô tả cột chi tiết ở mục 4 sẽ được bổ sung khi viết từng migration.</w:t>
+        <w:t xml:space="preserve">Lộ trình đã đánh số lại sau khi nghiên cứu nghiệp vụ chấm IELTS (tài liệu 08). Ở bước 12, migration Mức 2 (trước gộp trong V6) được tách theo từng bước — V6 audit, V7 chat, V8 bản nháp — để mỗi bước tự chứa bảng và entity của mình; Mức 3 dời sang V9 trở đi, rồi V11 trở đi khi V9, V10 dùng cho đánh dấu trên bài (F5b). Mô tả cột chi tiết ở mục 4 sẽ được bổ sung khi viết từng migration.</w:t>
       </w:r>
     </w:p>
     <w:p>
@@ -1542,7 +1760,7 @@
       <w:r>
         <w:drawing>
           <wp:inline>
-            <wp:extent cx="5334000" cy="4850946"/>
+            <wp:extent cx="5334000" cy="5143500"/>
             <wp:effectExtent b="0" l="0" r="0" t="0"/>
             <wp:docPr descr="Hình 04.3" title="" id="23" name="Picture"/>
             <a:graphic>
@@ -1563,7 +1781,7 @@
                   <pic:spPr bwMode="auto">
                     <a:xfrm>
                       <a:off x="0" y="0"/>
-                      <a:ext cx="5334000" cy="4850946"/>
+                      <a:ext cx="5334000" cy="5143500"/>
                     </a:xfrm>
                     <a:prstGeom prst="rect">
                       <a:avLst/>
@@ -4420,7 +4638,7 @@
       </w:r>
     </w:p>
     <w:bookmarkEnd w:id="41"/>
-    <w:bookmarkStart w:id="42" w:name="X25abd2114553b20084e34a658df9a9bf6057bc9"/>
+    <w:bookmarkStart w:id="42" w:name="X6a8235ae74c7a5af911d554f0ed35e5c8a9db88"/>
     <w:p>
       <w:pPr>
         <w:pStyle w:val="Heading4"/>
@@ -4435,7 +4653,7 @@
         <w:t xml:space="preserve"> </w:t>
       </w:r>
       <w:r>
-        <w:t xml:space="preserve">— các phần của bài (V1, V4, V9+)</w:t>
+        <w:t xml:space="preserve">— các phần của bài (V1, V4, V11+)</w:t>
       </w:r>
     </w:p>
     <w:tbl>
@@ -5022,7 +5240,7 @@
               <w:pStyle w:val="Compact"/>
             </w:pPr>
             <w:r>
-              <w:t xml:space="preserve">(V9+, Mức 3) DF false</w:t>
+              <w:t xml:space="preserve">(V11+, Mức 3) DF false</w:t>
             </w:r>
           </w:p>
         </w:tc>
@@ -5068,7 +5286,7 @@
               <w:pStyle w:val="Compact"/>
             </w:pPr>
             <w:r>
-              <w:t xml:space="preserve">(V9+, Mức 3)</w:t>
+              <w:t xml:space="preserve">(V10+, Mức 3)</w:t>
             </w:r>
           </w:p>
         </w:tc>
@@ -8719,7 +8937,7 @@
       </w:r>
     </w:p>
     <w:bookmarkEnd w:id="53"/>
-    <w:bookmarkStart w:id="54" w:name="Xc3cd27b674b30357a665d098a80832b3f866b46"/>
+    <w:bookmarkStart w:id="54" w:name="X1610e5b598e8d95e27626031f5256a1d9544189"/>
     <w:p>
       <w:pPr>
         <w:pStyle w:val="Heading4"/>
@@ -8734,7 +8952,7 @@
         <w:t xml:space="preserve"> </w:t>
       </w:r>
       <w:r>
-        <w:t xml:space="preserve">— nhận xét gắn vào đoạn văn (V1, V5)</w:t>
+        <w:t xml:space="preserve">— nhận xét gắn vào đoạn văn (V1, V5, V9, V10)</w:t>
       </w:r>
     </w:p>
     <w:tbl>
@@ -9199,6 +9417,469 @@
               <w:pStyle w:val="Compact"/>
             </w:pPr>
             <w:r>
+              <w:t xml:space="preserve">kind</w:t>
+            </w:r>
+          </w:p>
+        </w:tc>
+        <w:tc>
+          <w:tcPr/>
+          <w:p>
+            <w:pPr>
+              <w:pStyle w:val="Compact"/>
+            </w:pPr>
+            <w:r>
+              <w:t xml:space="preserve">VARCHAR(10)</w:t>
+            </w:r>
+          </w:p>
+        </w:tc>
+        <w:tc>
+          <w:tcPr/>
+          <w:p>
+            <w:pPr>
+              <w:pStyle w:val="Compact"/>
+            </w:pPr>
+            <w:r>
+              <w:t xml:space="preserve">(V9, V10) NN, DF</w:t>
+            </w:r>
+            <w:r>
+              <w:t xml:space="preserve"> </w:t>
+            </w:r>
+            <w:r>
+              <w:rPr>
+                <w:rStyle w:val="VerbatimChar"/>
+              </w:rPr>
+              <w:t xml:space="preserve">ERROR</w:t>
+            </w:r>
+            <w:r>
+              <w:t xml:space="preserve">, CK</w:t>
+            </w:r>
+            <w:r>
+              <w:t xml:space="preserve"> </w:t>
+            </w:r>
+            <w:r>
+              <w:rPr>
+                <w:rStyle w:val="VerbatimChar"/>
+              </w:rPr>
+              <w:t xml:space="preserve">ERROR</w:t>
+            </w:r>
+            <w:r>
+              <w:t xml:space="preserve"> </w:t>
+            </w:r>
+            <w:r>
+              <w:t xml:space="preserve">/</w:t>
+            </w:r>
+            <w:r>
+              <w:t xml:space="preserve"> </w:t>
+            </w:r>
+            <w:r>
+              <w:rPr>
+                <w:rStyle w:val="VerbatimChar"/>
+              </w:rPr>
+              <w:t xml:space="preserve">HIGHLIGHT</w:t>
+            </w:r>
+            <w:r>
+              <w:t xml:space="preserve"> </w:t>
+            </w:r>
+            <w:r>
+              <w:t xml:space="preserve">/</w:t>
+            </w:r>
+            <w:r>
+              <w:t xml:space="preserve"> </w:t>
+            </w:r>
+            <w:r>
+              <w:rPr>
+                <w:rStyle w:val="VerbatimChar"/>
+              </w:rPr>
+              <w:t xml:space="preserve">GOOD</w:t>
+            </w:r>
+            <w:r>
+              <w:t xml:space="preserve"> </w:t>
+            </w:r>
+            <w:r>
+              <w:t xml:space="preserve">/</w:t>
+            </w:r>
+            <w:r>
+              <w:t xml:space="preserve"> </w:t>
+            </w:r>
+            <w:r>
+              <w:rPr>
+                <w:rStyle w:val="VerbatimChar"/>
+              </w:rPr>
+              <w:t xml:space="preserve">COMMENT</w:t>
+            </w:r>
+          </w:p>
+        </w:tc>
+        <w:tc>
+          <w:tcPr/>
+          <w:p>
+            <w:pPr>
+              <w:pStyle w:val="Compact"/>
+            </w:pPr>
+            <w:r>
+              <w:t xml:space="preserve">Kiểu đánh dấu: lỗi (gạch gợn sóng) / lưu ý (vàng) / dùng hay (xanh) / nhận xét (xám, V10). Chỉ</w:t>
+            </w:r>
+            <w:r>
+              <w:t xml:space="preserve"> </w:t>
+            </w:r>
+            <w:r>
+              <w:rPr>
+                <w:rStyle w:val="VerbatimChar"/>
+              </w:rPr>
+              <w:t xml:space="preserve">ERROR</w:t>
+            </w:r>
+            <w:r>
+              <w:t xml:space="preserve"> </w:t>
+            </w:r>
+            <w:r>
+              <w:t xml:space="preserve">được tính vào thống kê lỗi; kiểu khác không mang mã lỗi (trừ mã khen);</w:t>
+            </w:r>
+            <w:r>
+              <w:t xml:space="preserve"> </w:t>
+            </w:r>
+            <w:r>
+              <w:rPr>
+                <w:rStyle w:val="VerbatimChar"/>
+              </w:rPr>
+              <w:t xml:space="preserve">COMMENT</w:t>
+            </w:r>
+            <w:r>
+              <w:t xml:space="preserve"> </w:t>
+            </w:r>
+            <w:r>
+              <w:t xml:space="preserve">phải có</w:t>
+            </w:r>
+            <w:r>
+              <w:t xml:space="preserve"> </w:t>
+            </w:r>
+            <w:r>
+              <w:rPr>
+                <w:rStyle w:val="VerbatimChar"/>
+              </w:rPr>
+              <w:t xml:space="preserve">comment</w:t>
+            </w:r>
+          </w:p>
+        </w:tc>
+      </w:tr>
+      <w:tr>
+        <w:tc>
+          <w:tcPr/>
+          <w:p>
+            <w:pPr>
+              <w:pStyle w:val="Compact"/>
+            </w:pPr>
+            <w:r>
+              <w:t xml:space="preserve">edit</w:t>
+            </w:r>
+          </w:p>
+        </w:tc>
+        <w:tc>
+          <w:tcPr/>
+          <w:p>
+            <w:pPr>
+              <w:pStyle w:val="Compact"/>
+            </w:pPr>
+            <w:r>
+              <w:t xml:space="preserve">VARCHAR(10)</w:t>
+            </w:r>
+          </w:p>
+        </w:tc>
+        <w:tc>
+          <w:tcPr/>
+          <w:p>
+            <w:pPr>
+              <w:pStyle w:val="Compact"/>
+            </w:pPr>
+            <w:r>
+              <w:t xml:space="preserve">(V10) CK</w:t>
+            </w:r>
+            <w:r>
+              <w:t xml:space="preserve"> </w:t>
+            </w:r>
+            <w:r>
+              <w:rPr>
+                <w:rStyle w:val="VerbatimChar"/>
+              </w:rPr>
+              <w:t xml:space="preserve">REPLACE</w:t>
+            </w:r>
+            <w:r>
+              <w:t xml:space="preserve"> </w:t>
+            </w:r>
+            <w:r>
+              <w:t xml:space="preserve">/</w:t>
+            </w:r>
+            <w:r>
+              <w:t xml:space="preserve"> </w:t>
+            </w:r>
+            <w:r>
+              <w:rPr>
+                <w:rStyle w:val="VerbatimChar"/>
+              </w:rPr>
+              <w:t xml:space="preserve">DELETE</w:t>
+            </w:r>
+            <w:r>
+              <w:t xml:space="preserve"> </w:t>
+            </w:r>
+            <w:r>
+              <w:t xml:space="preserve">/</w:t>
+            </w:r>
+            <w:r>
+              <w:t xml:space="preserve"> </w:t>
+            </w:r>
+            <w:r>
+              <w:rPr>
+                <w:rStyle w:val="VerbatimChar"/>
+              </w:rPr>
+              <w:t xml:space="preserve">INSERT</w:t>
+            </w:r>
+          </w:p>
+        </w:tc>
+        <w:tc>
+          <w:tcPr/>
+          <w:p>
+            <w:pPr>
+              <w:pStyle w:val="Compact"/>
+            </w:pPr>
+            <w:r>
+              <w:t xml:space="preserve">Sửa kiểu track changes, chỉ với</w:t>
+            </w:r>
+            <w:r>
+              <w:t xml:space="preserve"> </w:t>
+            </w:r>
+            <w:r>
+              <w:rPr>
+                <w:rStyle w:val="VerbatimChar"/>
+              </w:rPr>
+              <w:t xml:space="preserve">ERROR</w:t>
+            </w:r>
+            <w:r>
+              <w:t xml:space="preserve">:</w:t>
+            </w:r>
+            <w:r>
+              <w:t xml:space="preserve"> </w:t>
+            </w:r>
+            <w:r>
+              <w:rPr>
+                <w:rStyle w:val="VerbatimChar"/>
+              </w:rPr>
+              <w:t xml:space="preserve">REPLACE</w:t>
+            </w:r>
+            <w:r>
+              <w:t xml:space="preserve"> </w:t>
+            </w:r>
+            <w:r>
+              <w:t xml:space="preserve">/</w:t>
+            </w:r>
+            <w:r>
+              <w:t xml:space="preserve"> </w:t>
+            </w:r>
+            <w:r>
+              <w:rPr>
+                <w:rStyle w:val="VerbatimChar"/>
+              </w:rPr>
+              <w:t xml:space="preserve">INSERT</w:t>
+            </w:r>
+            <w:r>
+              <w:t xml:space="preserve"> </w:t>
+            </w:r>
+            <w:r>
+              <w:t xml:space="preserve">dùng</w:t>
+            </w:r>
+            <w:r>
+              <w:t xml:space="preserve"> </w:t>
+            </w:r>
+            <w:r>
+              <w:rPr>
+                <w:rStyle w:val="VerbatimChar"/>
+              </w:rPr>
+              <w:t xml:space="preserve">suggestion</w:t>
+            </w:r>
+            <w:r>
+              <w:t xml:space="preserve"> </w:t>
+            </w:r>
+            <w:r>
+              <w:t xml:space="preserve">làm chữ mới (bắt buộc),</w:t>
+            </w:r>
+            <w:r>
+              <w:t xml:space="preserve"> </w:t>
+            </w:r>
+            <w:r>
+              <w:rPr>
+                <w:rStyle w:val="VerbatimChar"/>
+              </w:rPr>
+              <w:t xml:space="preserve">DELETE</w:t>
+            </w:r>
+            <w:r>
+              <w:t xml:space="preserve"> </w:t>
+            </w:r>
+            <w:r>
+              <w:t xml:space="preserve">không có</w:t>
+            </w:r>
+            <w:r>
+              <w:t xml:space="preserve"> </w:t>
+            </w:r>
+            <w:r>
+              <w:rPr>
+                <w:rStyle w:val="VerbatimChar"/>
+              </w:rPr>
+              <w:t xml:space="preserve">suggestion</w:t>
+            </w:r>
+            <w:r>
+              <w:t xml:space="preserve">. Bản ghi cũ có</w:t>
+            </w:r>
+            <w:r>
+              <w:t xml:space="preserve"> </w:t>
+            </w:r>
+            <w:r>
+              <w:rPr>
+                <w:rStyle w:val="VerbatimChar"/>
+              </w:rPr>
+              <w:t xml:space="preserve">suggestion</w:t>
+            </w:r>
+            <w:r>
+              <w:t xml:space="preserve"> </w:t>
+            </w:r>
+            <w:r>
+              <w:t xml:space="preserve">được đặt</w:t>
+            </w:r>
+            <w:r>
+              <w:t xml:space="preserve"> </w:t>
+            </w:r>
+            <w:r>
+              <w:rPr>
+                <w:rStyle w:val="VerbatimChar"/>
+              </w:rPr>
+              <w:t xml:space="preserve">REPLACE</w:t>
+            </w:r>
+            <w:r>
+              <w:t xml:space="preserve">. Chữ gốc không đổi</w:t>
+            </w:r>
+          </w:p>
+        </w:tc>
+      </w:tr>
+      <w:tr>
+        <w:tc>
+          <w:tcPr/>
+          <w:p>
+            <w:pPr>
+              <w:pStyle w:val="Compact"/>
+            </w:pPr>
+            <w:r>
+              <w:t xml:space="preserve">resolution</w:t>
+            </w:r>
+          </w:p>
+        </w:tc>
+        <w:tc>
+          <w:tcPr/>
+          <w:p>
+            <w:pPr>
+              <w:pStyle w:val="Compact"/>
+            </w:pPr>
+            <w:r>
+              <w:t xml:space="preserve">VARCHAR(10)</w:t>
+            </w:r>
+          </w:p>
+        </w:tc>
+        <w:tc>
+          <w:tcPr/>
+          <w:p>
+            <w:pPr>
+              <w:pStyle w:val="Compact"/>
+            </w:pPr>
+            <w:r>
+              <w:t xml:space="preserve">(V9) CK</w:t>
+            </w:r>
+            <w:r>
+              <w:t xml:space="preserve"> </w:t>
+            </w:r>
+            <w:r>
+              <w:rPr>
+                <w:rStyle w:val="VerbatimChar"/>
+              </w:rPr>
+              <w:t xml:space="preserve">FIXED</w:t>
+            </w:r>
+            <w:r>
+              <w:t xml:space="preserve"> </w:t>
+            </w:r>
+            <w:r>
+              <w:t xml:space="preserve">/</w:t>
+            </w:r>
+            <w:r>
+              <w:t xml:space="preserve"> </w:t>
+            </w:r>
+            <w:r>
+              <w:rPr>
+                <w:rStyle w:val="VerbatimChar"/>
+              </w:rPr>
+              <w:t xml:space="preserve">NOT_FIXED</w:t>
+            </w:r>
+            <w:r>
+              <w:t xml:space="preserve"> </w:t>
+            </w:r>
+            <w:r>
+              <w:t xml:space="preserve">/</w:t>
+            </w:r>
+            <w:r>
+              <w:t xml:space="preserve"> </w:t>
+            </w:r>
+            <w:r>
+              <w:rPr>
+                <w:rStyle w:val="VerbatimChar"/>
+              </w:rPr>
+              <w:t xml:space="preserve">CHANGED</w:t>
+            </w:r>
+          </w:p>
+        </w:tc>
+        <w:tc>
+          <w:tcPr/>
+          <w:p>
+            <w:pPr>
+              <w:pStyle w:val="Compact"/>
+            </w:pPr>
+            <w:r>
+              <w:t xml:space="preserve">Giáo viên đánh giá lỗi của lần nộp</w:t>
+            </w:r>
+            <w:r>
+              <w:t xml:space="preserve"> </w:t>
+            </w:r>
+            <w:r>
+              <w:rPr>
+                <w:b/>
+                <w:bCs/>
+              </w:rPr>
+              <w:t xml:space="preserve">cũ</w:t>
+            </w:r>
+            <w:r>
+              <w:t xml:space="preserve"> </w:t>
+            </w:r>
+            <w:r>
+              <w:t xml:space="preserve">khi so sánh với lần sau: đã sửa / chưa sửa / đổi khác gợi ý.</w:t>
+            </w:r>
+            <w:r>
+              <w:t xml:space="preserve"> </w:t>
+            </w:r>
+            <w:r>
+              <w:rPr>
+                <w:rStyle w:val="VerbatimChar"/>
+              </w:rPr>
+              <w:t xml:space="preserve">NULL</w:t>
+            </w:r>
+            <w:r>
+              <w:t xml:space="preserve"> </w:t>
+            </w:r>
+            <w:r>
+              <w:t xml:space="preserve">= giao diện tự đoán bằng cách ghép đoạn trích</w:t>
+            </w:r>
+          </w:p>
+        </w:tc>
+      </w:tr>
+      <w:tr>
+        <w:tc>
+          <w:tcPr/>
+          <w:p>
+            <w:pPr>
+              <w:pStyle w:val="Compact"/>
+            </w:pPr>
+            <w:r>
               <w:t xml:space="preserve">created_at</w:t>
             </w:r>
           </w:p>
@@ -9268,7 +9949,10 @@
         <w:t xml:space="preserve">chk_inline_has_content</w:t>
       </w:r>
       <w:r>
-        <w:t xml:space="preserve">: có ít nhất một trong</w:t>
+        <w:t xml:space="preserve"> </w:t>
+      </w:r>
+      <w:r>
+        <w:t xml:space="preserve">(V10): lỗi phải có ít nhất một trong</w:t>
       </w:r>
       <w:r>
         <w:t xml:space="preserve"> </w:t>
@@ -9304,10 +9988,103 @@
         <w:t xml:space="preserve">suggestion</w:t>
       </w:r>
       <w:r>
-        <w:t xml:space="preserve"> </w:t>
-      </w:r>
-      <w:r>
-        <w:t xml:space="preserve">(BR-21).</w:t>
+        <w:t xml:space="preserve">,</w:t>
+      </w:r>
+      <w:r>
+        <w:t xml:space="preserve"> </w:t>
+      </w:r>
+      <w:r>
+        <w:rPr>
+          <w:rStyle w:val="VerbatimChar"/>
+        </w:rPr>
+        <w:t xml:space="preserve">edit</w:t>
+      </w:r>
+      <w:r>
+        <w:t xml:space="preserve"> </w:t>
+      </w:r>
+      <w:r>
+        <w:t xml:space="preserve">(BR-21);</w:t>
+      </w:r>
+      <w:r>
+        <w:t xml:space="preserve"> </w:t>
+      </w:r>
+      <w:r>
+        <w:rPr>
+          <w:rStyle w:val="VerbatimChar"/>
+        </w:rPr>
+        <w:t xml:space="preserve">COMMENT</w:t>
+      </w:r>
+      <w:r>
+        <w:t xml:space="preserve"> </w:t>
+      </w:r>
+      <w:r>
+        <w:t xml:space="preserve">phải có</w:t>
+      </w:r>
+      <w:r>
+        <w:t xml:space="preserve"> </w:t>
+      </w:r>
+      <w:r>
+        <w:rPr>
+          <w:rStyle w:val="VerbatimChar"/>
+        </w:rPr>
+        <w:t xml:space="preserve">comment</w:t>
+      </w:r>
+      <w:r>
+        <w:t xml:space="preserve">;</w:t>
+      </w:r>
+      <w:r>
+        <w:t xml:space="preserve"> </w:t>
+      </w:r>
+      <w:r>
+        <w:rPr>
+          <w:rStyle w:val="VerbatimChar"/>
+        </w:rPr>
+        <w:t xml:space="preserve">REPLACE</w:t>
+      </w:r>
+      <w:r>
+        <w:t xml:space="preserve"> </w:t>
+      </w:r>
+      <w:r>
+        <w:t xml:space="preserve">/</w:t>
+      </w:r>
+      <w:r>
+        <w:t xml:space="preserve"> </w:t>
+      </w:r>
+      <w:r>
+        <w:rPr>
+          <w:rStyle w:val="VerbatimChar"/>
+        </w:rPr>
+        <w:t xml:space="preserve">INSERT</w:t>
+      </w:r>
+      <w:r>
+        <w:t xml:space="preserve"> </w:t>
+      </w:r>
+      <w:r>
+        <w:t xml:space="preserve">phải có</w:t>
+      </w:r>
+      <w:r>
+        <w:t xml:space="preserve"> </w:t>
+      </w:r>
+      <w:r>
+        <w:rPr>
+          <w:rStyle w:val="VerbatimChar"/>
+        </w:rPr>
+        <w:t xml:space="preserve">suggestion</w:t>
+      </w:r>
+      <w:r>
+        <w:t xml:space="preserve">; lưu ý / dùng hay được để trống (chỉ tô màu).</w:t>
+      </w:r>
+    </w:p>
+    <w:p>
+      <w:pPr>
+        <w:pStyle w:val="Compact"/>
+        <w:numPr>
+          <w:ilvl w:val="0"/>
+          <w:numId w:val="1003"/>
+        </w:numPr>
+      </w:pPr>
+      <w:r>
+        <w:t xml:space="preserve">Không lưu prefix / suffix của đoạn trích: khi so sánh 2 lần nộp, giao diện lấy từ nội dung lần nộp cũ (bất biến) theo offset.</w:t>
       </w:r>
     </w:p>
     <w:bookmarkEnd w:id="54"/>
@@ -9944,7 +10721,34 @@
         <w:t xml:space="preserve"> </w:t>
       </w:r>
       <w:r>
-        <w:t xml:space="preserve">mục 4.3.</w:t>
+        <w:t xml:space="preserve">mục 4.3 (V5), thêm</w:t>
+      </w:r>
+      <w:r>
+        <w:t xml:space="preserve"> </w:t>
+      </w:r>
+      <w:r>
+        <w:rPr>
+          <w:rStyle w:val="VerbatimChar"/>
+        </w:rPr>
+        <w:t xml:space="preserve">GR</w:t>
+      </w:r>
+      <w:r>
+        <w:t xml:space="preserve">,</w:t>
+      </w:r>
+      <w:r>
+        <w:t xml:space="preserve"> </w:t>
+      </w:r>
+      <w:r>
+        <w:rPr>
+          <w:rStyle w:val="VerbatimChar"/>
+        </w:rPr>
+        <w:t xml:space="preserve">OTHER</w:t>
+      </w:r>
+      <w:r>
+        <w:t xml:space="preserve"> </w:t>
+      </w:r>
+      <w:r>
+        <w:t xml:space="preserve">ở V9.</w:t>
       </w:r>
     </w:p>
     <w:bookmarkEnd w:id="55"/>
@@ -12386,13 +13190,13 @@
     </w:p>
     <w:bookmarkEnd w:id="62"/>
     <w:bookmarkEnd w:id="63"/>
-    <w:bookmarkStart w:id="64" w:name="X0f2bd21144d7a14dda88d1d55b50bf6de6ed029"/>
+    <w:bookmarkStart w:id="64" w:name="Xde7190028ce23d571b15c62522dffdcbbda96ff"/>
     <w:p>
       <w:pPr>
         <w:pStyle w:val="Heading3"/>
       </w:pPr>
       <w:r>
-        <w:t xml:space="preserve">4.7 Nhóm mở rộng (V9 trở đi, Mức 3)</w:t>
+        <w:t xml:space="preserve">4.7 Nhóm mở rộng (V11 trở đi, Mức 3)</w:t>
       </w:r>
     </w:p>
     <w:tbl>

</xml_diff>

<commit_message>
Module giao bài và chấm bài: hàng đợi chấm, chấm theo rubric + checklist giới hạn điểm, tính band
</commit_message>
<xml_diff>
--- a/docx/04-erd.docx
+++ b/docx/04-erd.docx
@@ -1313,225 +1313,7 @@
               <w:rPr>
                 <w:rStyle w:val="VerbatimChar"/>
               </w:rPr>
-              <w:t xml:space="preserve">V9__inline_comment_kind.sql</w:t>
-            </w:r>
-          </w:p>
-        </w:tc>
-        <w:tc>
-          <w:tcPr/>
-          <w:p>
-            <w:pPr>
-              <w:pStyle w:val="Compact"/>
-            </w:pPr>
-            <w:r>
-              <w:t xml:space="preserve">Mức 2 / F5b</w:t>
-            </w:r>
-          </w:p>
-        </w:tc>
-        <w:tc>
-          <w:tcPr/>
-          <w:p>
-            <w:pPr>
-              <w:pStyle w:val="Compact"/>
-            </w:pPr>
-            <w:r>
-              <w:rPr>
-                <w:rStyle w:val="VerbatimChar"/>
-              </w:rPr>
-              <w:t xml:space="preserve">inline_comments.kind</w:t>
-            </w:r>
-            <w:r>
-              <w:t xml:space="preserve"> </w:t>
-            </w:r>
-            <w:r>
-              <w:t xml:space="preserve">(lỗi / lưu ý / dùng hay),</w:t>
-            </w:r>
-            <w:r>
-              <w:t xml:space="preserve"> </w:t>
-            </w:r>
-            <w:r>
-              <w:rPr>
-                <w:rStyle w:val="VerbatimChar"/>
-              </w:rPr>
-              <w:t xml:space="preserve">inline_comments.resolution</w:t>
-            </w:r>
-            <w:r>
-              <w:t xml:space="preserve"> </w:t>
-            </w:r>
-            <w:r>
-              <w:t xml:space="preserve">(đánh giá đã sửa khi so sánh 2 lần nộp); nới CK</w:t>
-            </w:r>
-            <w:r>
-              <w:t xml:space="preserve"> </w:t>
-            </w:r>
-            <w:r>
-              <w:rPr>
-                <w:rStyle w:val="VerbatimChar"/>
-              </w:rPr>
-              <w:t xml:space="preserve">chk_inline_has_content</w:t>
-            </w:r>
-            <w:r>
-              <w:t xml:space="preserve"> </w:t>
-            </w:r>
-            <w:r>
-              <w:t xml:space="preserve">cho lưu ý / dùng hay; thêm mã hệ thống</w:t>
-            </w:r>
-            <w:r>
-              <w:t xml:space="preserve"> </w:t>
-            </w:r>
-            <w:r>
-              <w:rPr>
-                <w:rStyle w:val="VerbatimChar"/>
-              </w:rPr>
-              <w:t xml:space="preserve">GR</w:t>
-            </w:r>
-            <w:r>
-              <w:t xml:space="preserve">,</w:t>
-            </w:r>
-            <w:r>
-              <w:t xml:space="preserve"> </w:t>
-            </w:r>
-            <w:r>
-              <w:rPr>
-                <w:rStyle w:val="VerbatimChar"/>
-              </w:rPr>
-              <w:t xml:space="preserve">OTHER</w:t>
-            </w:r>
-          </w:p>
-        </w:tc>
-        <w:tc>
-          <w:tcPr/>
-          <w:p>
-            <w:pPr>
-              <w:pStyle w:val="Compact"/>
-            </w:pPr>
-            <w:r>
-              <w:t xml:space="preserve">✅ đã viết</w:t>
-            </w:r>
-          </w:p>
-        </w:tc>
-      </w:tr>
-      <w:tr>
-        <w:tc>
-          <w:tcPr/>
-          <w:p>
-            <w:pPr>
-              <w:pStyle w:val="Compact"/>
-            </w:pPr>
-            <w:r>
-              <w:rPr>
-                <w:rStyle w:val="VerbatimChar"/>
-              </w:rPr>
-              <w:t xml:space="preserve">V10__inline_comment_edit.sql</w:t>
-            </w:r>
-          </w:p>
-        </w:tc>
-        <w:tc>
-          <w:tcPr/>
-          <w:p>
-            <w:pPr>
-              <w:pStyle w:val="Compact"/>
-            </w:pPr>
-            <w:r>
-              <w:t xml:space="preserve">Mức 2 / F5b</w:t>
-            </w:r>
-          </w:p>
-        </w:tc>
-        <w:tc>
-          <w:tcPr/>
-          <w:p>
-            <w:pPr>
-              <w:pStyle w:val="Compact"/>
-            </w:pPr>
-            <w:r>
-              <w:rPr>
-                <w:rStyle w:val="VerbatimChar"/>
-              </w:rPr>
-              <w:t xml:space="preserve">inline_comments.edit</w:t>
-            </w:r>
-            <w:r>
-              <w:t xml:space="preserve"> </w:t>
-            </w:r>
-            <w:r>
-              <w:t xml:space="preserve">(REPLACE / DELETE / INSERT — sửa kiểu track changes),</w:t>
-            </w:r>
-            <w:r>
-              <w:t xml:space="preserve"> </w:t>
-            </w:r>
-            <w:r>
-              <w:rPr>
-                <w:rStyle w:val="VerbatimChar"/>
-              </w:rPr>
-              <w:t xml:space="preserve">kind</w:t>
-            </w:r>
-            <w:r>
-              <w:t xml:space="preserve"> </w:t>
-            </w:r>
-            <w:r>
-              <w:t xml:space="preserve">thêm</w:t>
-            </w:r>
-            <w:r>
-              <w:t xml:space="preserve"> </w:t>
-            </w:r>
-            <w:r>
-              <w:rPr>
-                <w:rStyle w:val="VerbatimChar"/>
-              </w:rPr>
-              <w:t xml:space="preserve">COMMENT</w:t>
-            </w:r>
-            <w:r>
-              <w:t xml:space="preserve">; CK</w:t>
-            </w:r>
-            <w:r>
-              <w:t xml:space="preserve"> </w:t>
-            </w:r>
-            <w:r>
-              <w:rPr>
-                <w:rStyle w:val="VerbatimChar"/>
-              </w:rPr>
-              <w:t xml:space="preserve">chk_inline_has_content</w:t>
-            </w:r>
-            <w:r>
-              <w:t xml:space="preserve"> </w:t>
-            </w:r>
-            <w:r>
-              <w:t xml:space="preserve">tính cả</w:t>
-            </w:r>
-            <w:r>
-              <w:t xml:space="preserve"> </w:t>
-            </w:r>
-            <w:r>
-              <w:rPr>
-                <w:rStyle w:val="VerbatimChar"/>
-              </w:rPr>
-              <w:t xml:space="preserve">edit</w:t>
-            </w:r>
-          </w:p>
-        </w:tc>
-        <w:tc>
-          <w:tcPr/>
-          <w:p>
-            <w:pPr>
-              <w:pStyle w:val="Compact"/>
-            </w:pPr>
-            <w:r>
-              <w:t xml:space="preserve">✅ đã viết</w:t>
-            </w:r>
-          </w:p>
-        </w:tc>
-      </w:tr>
-      <w:tr>
-        <w:tc>
-          <w:tcPr/>
-          <w:p>
-            <w:pPr>
-              <w:pStyle w:val="Compact"/>
-            </w:pPr>
-            <w:r>
-              <w:rPr>
-                <w:rStyle w:val="VerbatimChar"/>
-              </w:rPr>
-              <w:t xml:space="preserve">V11__…</w:t>
+              <w:t xml:space="preserve">V9__…</w:t>
             </w:r>
             <w:r>
               <w:t xml:space="preserve"> </w:t>
@@ -1602,7 +1384,7 @@
         <w:pStyle w:val="BlockText"/>
       </w:pPr>
       <w:r>
-        <w:t xml:space="preserve">Lộ trình đã đánh số lại sau khi nghiên cứu nghiệp vụ chấm IELTS (tài liệu 08). Ở bước 12, migration Mức 2 (trước gộp trong V6) được tách theo từng bước — V6 audit, V7 chat, V8 bản nháp — để mỗi bước tự chứa bảng và entity của mình; Mức 3 dời sang V9 trở đi, rồi V11 trở đi khi V9, V10 dùng cho đánh dấu trên bài (F5b). Mô tả cột chi tiết ở mục 4 sẽ được bổ sung khi viết từng migration.</w:t>
+        <w:t xml:space="preserve">Lộ trình đã đánh số lại sau khi nghiên cứu nghiệp vụ chấm IELTS (tài liệu 08). Ở bước 12, migration Mức 2 (trước gộp trong V6) được tách theo từng bước — V6 audit, V7 chat, V8 bản nháp — để mỗi bước tự chứa bảng và entity của mình; Mức 3 dời sang V9 trở đi. Mô tả cột chi tiết ở mục 4 sẽ được bổ sung khi viết từng migration.</w:t>
       </w:r>
     </w:p>
     <w:p>
@@ -1760,7 +1542,7 @@
       <w:r>
         <w:drawing>
           <wp:inline>
-            <wp:extent cx="5334000" cy="5143500"/>
+            <wp:extent cx="5334000" cy="4850946"/>
             <wp:effectExtent b="0" l="0" r="0" t="0"/>
             <wp:docPr descr="Hình 04.3" title="" id="23" name="Picture"/>
             <a:graphic>
@@ -1781,7 +1563,7 @@
                   <pic:spPr bwMode="auto">
                     <a:xfrm>
                       <a:off x="0" y="0"/>
-                      <a:ext cx="5334000" cy="5143500"/>
+                      <a:ext cx="5334000" cy="4850946"/>
                     </a:xfrm>
                     <a:prstGeom prst="rect">
                       <a:avLst/>
@@ -4638,7 +4420,7 @@
       </w:r>
     </w:p>
     <w:bookmarkEnd w:id="41"/>
-    <w:bookmarkStart w:id="42" w:name="X6a8235ae74c7a5af911d554f0ed35e5c8a9db88"/>
+    <w:bookmarkStart w:id="42" w:name="X25abd2114553b20084e34a658df9a9bf6057bc9"/>
     <w:p>
       <w:pPr>
         <w:pStyle w:val="Heading4"/>
@@ -4653,7 +4435,7 @@
         <w:t xml:space="preserve"> </w:t>
       </w:r>
       <w:r>
-        <w:t xml:space="preserve">— các phần của bài (V1, V4, V11+)</w:t>
+        <w:t xml:space="preserve">— các phần của bài (V1, V4, V9+)</w:t>
       </w:r>
     </w:p>
     <w:tbl>
@@ -5240,7 +5022,7 @@
               <w:pStyle w:val="Compact"/>
             </w:pPr>
             <w:r>
-              <w:t xml:space="preserve">(V11+, Mức 3) DF false</w:t>
+              <w:t xml:space="preserve">(V9+, Mức 3) DF false</w:t>
             </w:r>
           </w:p>
         </w:tc>
@@ -5286,7 +5068,7 @@
               <w:pStyle w:val="Compact"/>
             </w:pPr>
             <w:r>
-              <w:t xml:space="preserve">(V10+, Mức 3)</w:t>
+              <w:t xml:space="preserve">(V9+, Mức 3)</w:t>
             </w:r>
           </w:p>
         </w:tc>
@@ -8937,7 +8719,7 @@
       </w:r>
     </w:p>
     <w:bookmarkEnd w:id="53"/>
-    <w:bookmarkStart w:id="54" w:name="X1610e5b598e8d95e27626031f5256a1d9544189"/>
+    <w:bookmarkStart w:id="54" w:name="Xc3cd27b674b30357a665d098a80832b3f866b46"/>
     <w:p>
       <w:pPr>
         <w:pStyle w:val="Heading4"/>
@@ -8952,7 +8734,7 @@
         <w:t xml:space="preserve"> </w:t>
       </w:r>
       <w:r>
-        <w:t xml:space="preserve">— nhận xét gắn vào đoạn văn (V1, V5, V9, V10)</w:t>
+        <w:t xml:space="preserve">— nhận xét gắn vào đoạn văn (V1, V5)</w:t>
       </w:r>
     </w:p>
     <w:tbl>
@@ -9417,469 +9199,6 @@
               <w:pStyle w:val="Compact"/>
             </w:pPr>
             <w:r>
-              <w:t xml:space="preserve">kind</w:t>
-            </w:r>
-          </w:p>
-        </w:tc>
-        <w:tc>
-          <w:tcPr/>
-          <w:p>
-            <w:pPr>
-              <w:pStyle w:val="Compact"/>
-            </w:pPr>
-            <w:r>
-              <w:t xml:space="preserve">VARCHAR(10)</w:t>
-            </w:r>
-          </w:p>
-        </w:tc>
-        <w:tc>
-          <w:tcPr/>
-          <w:p>
-            <w:pPr>
-              <w:pStyle w:val="Compact"/>
-            </w:pPr>
-            <w:r>
-              <w:t xml:space="preserve">(V9, V10) NN, DF</w:t>
-            </w:r>
-            <w:r>
-              <w:t xml:space="preserve"> </w:t>
-            </w:r>
-            <w:r>
-              <w:rPr>
-                <w:rStyle w:val="VerbatimChar"/>
-              </w:rPr>
-              <w:t xml:space="preserve">ERROR</w:t>
-            </w:r>
-            <w:r>
-              <w:t xml:space="preserve">, CK</w:t>
-            </w:r>
-            <w:r>
-              <w:t xml:space="preserve"> </w:t>
-            </w:r>
-            <w:r>
-              <w:rPr>
-                <w:rStyle w:val="VerbatimChar"/>
-              </w:rPr>
-              <w:t xml:space="preserve">ERROR</w:t>
-            </w:r>
-            <w:r>
-              <w:t xml:space="preserve"> </w:t>
-            </w:r>
-            <w:r>
-              <w:t xml:space="preserve">/</w:t>
-            </w:r>
-            <w:r>
-              <w:t xml:space="preserve"> </w:t>
-            </w:r>
-            <w:r>
-              <w:rPr>
-                <w:rStyle w:val="VerbatimChar"/>
-              </w:rPr>
-              <w:t xml:space="preserve">HIGHLIGHT</w:t>
-            </w:r>
-            <w:r>
-              <w:t xml:space="preserve"> </w:t>
-            </w:r>
-            <w:r>
-              <w:t xml:space="preserve">/</w:t>
-            </w:r>
-            <w:r>
-              <w:t xml:space="preserve"> </w:t>
-            </w:r>
-            <w:r>
-              <w:rPr>
-                <w:rStyle w:val="VerbatimChar"/>
-              </w:rPr>
-              <w:t xml:space="preserve">GOOD</w:t>
-            </w:r>
-            <w:r>
-              <w:t xml:space="preserve"> </w:t>
-            </w:r>
-            <w:r>
-              <w:t xml:space="preserve">/</w:t>
-            </w:r>
-            <w:r>
-              <w:t xml:space="preserve"> </w:t>
-            </w:r>
-            <w:r>
-              <w:rPr>
-                <w:rStyle w:val="VerbatimChar"/>
-              </w:rPr>
-              <w:t xml:space="preserve">COMMENT</w:t>
-            </w:r>
-          </w:p>
-        </w:tc>
-        <w:tc>
-          <w:tcPr/>
-          <w:p>
-            <w:pPr>
-              <w:pStyle w:val="Compact"/>
-            </w:pPr>
-            <w:r>
-              <w:t xml:space="preserve">Kiểu đánh dấu: lỗi (gạch gợn sóng) / lưu ý (vàng) / dùng hay (xanh) / nhận xét (xám, V10). Chỉ</w:t>
-            </w:r>
-            <w:r>
-              <w:t xml:space="preserve"> </w:t>
-            </w:r>
-            <w:r>
-              <w:rPr>
-                <w:rStyle w:val="VerbatimChar"/>
-              </w:rPr>
-              <w:t xml:space="preserve">ERROR</w:t>
-            </w:r>
-            <w:r>
-              <w:t xml:space="preserve"> </w:t>
-            </w:r>
-            <w:r>
-              <w:t xml:space="preserve">được tính vào thống kê lỗi; kiểu khác không mang mã lỗi (trừ mã khen);</w:t>
-            </w:r>
-            <w:r>
-              <w:t xml:space="preserve"> </w:t>
-            </w:r>
-            <w:r>
-              <w:rPr>
-                <w:rStyle w:val="VerbatimChar"/>
-              </w:rPr>
-              <w:t xml:space="preserve">COMMENT</w:t>
-            </w:r>
-            <w:r>
-              <w:t xml:space="preserve"> </w:t>
-            </w:r>
-            <w:r>
-              <w:t xml:space="preserve">phải có</w:t>
-            </w:r>
-            <w:r>
-              <w:t xml:space="preserve"> </w:t>
-            </w:r>
-            <w:r>
-              <w:rPr>
-                <w:rStyle w:val="VerbatimChar"/>
-              </w:rPr>
-              <w:t xml:space="preserve">comment</w:t>
-            </w:r>
-          </w:p>
-        </w:tc>
-      </w:tr>
-      <w:tr>
-        <w:tc>
-          <w:tcPr/>
-          <w:p>
-            <w:pPr>
-              <w:pStyle w:val="Compact"/>
-            </w:pPr>
-            <w:r>
-              <w:t xml:space="preserve">edit</w:t>
-            </w:r>
-          </w:p>
-        </w:tc>
-        <w:tc>
-          <w:tcPr/>
-          <w:p>
-            <w:pPr>
-              <w:pStyle w:val="Compact"/>
-            </w:pPr>
-            <w:r>
-              <w:t xml:space="preserve">VARCHAR(10)</w:t>
-            </w:r>
-          </w:p>
-        </w:tc>
-        <w:tc>
-          <w:tcPr/>
-          <w:p>
-            <w:pPr>
-              <w:pStyle w:val="Compact"/>
-            </w:pPr>
-            <w:r>
-              <w:t xml:space="preserve">(V10) CK</w:t>
-            </w:r>
-            <w:r>
-              <w:t xml:space="preserve"> </w:t>
-            </w:r>
-            <w:r>
-              <w:rPr>
-                <w:rStyle w:val="VerbatimChar"/>
-              </w:rPr>
-              <w:t xml:space="preserve">REPLACE</w:t>
-            </w:r>
-            <w:r>
-              <w:t xml:space="preserve"> </w:t>
-            </w:r>
-            <w:r>
-              <w:t xml:space="preserve">/</w:t>
-            </w:r>
-            <w:r>
-              <w:t xml:space="preserve"> </w:t>
-            </w:r>
-            <w:r>
-              <w:rPr>
-                <w:rStyle w:val="VerbatimChar"/>
-              </w:rPr>
-              <w:t xml:space="preserve">DELETE</w:t>
-            </w:r>
-            <w:r>
-              <w:t xml:space="preserve"> </w:t>
-            </w:r>
-            <w:r>
-              <w:t xml:space="preserve">/</w:t>
-            </w:r>
-            <w:r>
-              <w:t xml:space="preserve"> </w:t>
-            </w:r>
-            <w:r>
-              <w:rPr>
-                <w:rStyle w:val="VerbatimChar"/>
-              </w:rPr>
-              <w:t xml:space="preserve">INSERT</w:t>
-            </w:r>
-          </w:p>
-        </w:tc>
-        <w:tc>
-          <w:tcPr/>
-          <w:p>
-            <w:pPr>
-              <w:pStyle w:val="Compact"/>
-            </w:pPr>
-            <w:r>
-              <w:t xml:space="preserve">Sửa kiểu track changes, chỉ với</w:t>
-            </w:r>
-            <w:r>
-              <w:t xml:space="preserve"> </w:t>
-            </w:r>
-            <w:r>
-              <w:rPr>
-                <w:rStyle w:val="VerbatimChar"/>
-              </w:rPr>
-              <w:t xml:space="preserve">ERROR</w:t>
-            </w:r>
-            <w:r>
-              <w:t xml:space="preserve">:</w:t>
-            </w:r>
-            <w:r>
-              <w:t xml:space="preserve"> </w:t>
-            </w:r>
-            <w:r>
-              <w:rPr>
-                <w:rStyle w:val="VerbatimChar"/>
-              </w:rPr>
-              <w:t xml:space="preserve">REPLACE</w:t>
-            </w:r>
-            <w:r>
-              <w:t xml:space="preserve"> </w:t>
-            </w:r>
-            <w:r>
-              <w:t xml:space="preserve">/</w:t>
-            </w:r>
-            <w:r>
-              <w:t xml:space="preserve"> </w:t>
-            </w:r>
-            <w:r>
-              <w:rPr>
-                <w:rStyle w:val="VerbatimChar"/>
-              </w:rPr>
-              <w:t xml:space="preserve">INSERT</w:t>
-            </w:r>
-            <w:r>
-              <w:t xml:space="preserve"> </w:t>
-            </w:r>
-            <w:r>
-              <w:t xml:space="preserve">dùng</w:t>
-            </w:r>
-            <w:r>
-              <w:t xml:space="preserve"> </w:t>
-            </w:r>
-            <w:r>
-              <w:rPr>
-                <w:rStyle w:val="VerbatimChar"/>
-              </w:rPr>
-              <w:t xml:space="preserve">suggestion</w:t>
-            </w:r>
-            <w:r>
-              <w:t xml:space="preserve"> </w:t>
-            </w:r>
-            <w:r>
-              <w:t xml:space="preserve">làm chữ mới (bắt buộc),</w:t>
-            </w:r>
-            <w:r>
-              <w:t xml:space="preserve"> </w:t>
-            </w:r>
-            <w:r>
-              <w:rPr>
-                <w:rStyle w:val="VerbatimChar"/>
-              </w:rPr>
-              <w:t xml:space="preserve">DELETE</w:t>
-            </w:r>
-            <w:r>
-              <w:t xml:space="preserve"> </w:t>
-            </w:r>
-            <w:r>
-              <w:t xml:space="preserve">không có</w:t>
-            </w:r>
-            <w:r>
-              <w:t xml:space="preserve"> </w:t>
-            </w:r>
-            <w:r>
-              <w:rPr>
-                <w:rStyle w:val="VerbatimChar"/>
-              </w:rPr>
-              <w:t xml:space="preserve">suggestion</w:t>
-            </w:r>
-            <w:r>
-              <w:t xml:space="preserve">. Bản ghi cũ có</w:t>
-            </w:r>
-            <w:r>
-              <w:t xml:space="preserve"> </w:t>
-            </w:r>
-            <w:r>
-              <w:rPr>
-                <w:rStyle w:val="VerbatimChar"/>
-              </w:rPr>
-              <w:t xml:space="preserve">suggestion</w:t>
-            </w:r>
-            <w:r>
-              <w:t xml:space="preserve"> </w:t>
-            </w:r>
-            <w:r>
-              <w:t xml:space="preserve">được đặt</w:t>
-            </w:r>
-            <w:r>
-              <w:t xml:space="preserve"> </w:t>
-            </w:r>
-            <w:r>
-              <w:rPr>
-                <w:rStyle w:val="VerbatimChar"/>
-              </w:rPr>
-              <w:t xml:space="preserve">REPLACE</w:t>
-            </w:r>
-            <w:r>
-              <w:t xml:space="preserve">. Chữ gốc không đổi</w:t>
-            </w:r>
-          </w:p>
-        </w:tc>
-      </w:tr>
-      <w:tr>
-        <w:tc>
-          <w:tcPr/>
-          <w:p>
-            <w:pPr>
-              <w:pStyle w:val="Compact"/>
-            </w:pPr>
-            <w:r>
-              <w:t xml:space="preserve">resolution</w:t>
-            </w:r>
-          </w:p>
-        </w:tc>
-        <w:tc>
-          <w:tcPr/>
-          <w:p>
-            <w:pPr>
-              <w:pStyle w:val="Compact"/>
-            </w:pPr>
-            <w:r>
-              <w:t xml:space="preserve">VARCHAR(10)</w:t>
-            </w:r>
-          </w:p>
-        </w:tc>
-        <w:tc>
-          <w:tcPr/>
-          <w:p>
-            <w:pPr>
-              <w:pStyle w:val="Compact"/>
-            </w:pPr>
-            <w:r>
-              <w:t xml:space="preserve">(V9) CK</w:t>
-            </w:r>
-            <w:r>
-              <w:t xml:space="preserve"> </w:t>
-            </w:r>
-            <w:r>
-              <w:rPr>
-                <w:rStyle w:val="VerbatimChar"/>
-              </w:rPr>
-              <w:t xml:space="preserve">FIXED</w:t>
-            </w:r>
-            <w:r>
-              <w:t xml:space="preserve"> </w:t>
-            </w:r>
-            <w:r>
-              <w:t xml:space="preserve">/</w:t>
-            </w:r>
-            <w:r>
-              <w:t xml:space="preserve"> </w:t>
-            </w:r>
-            <w:r>
-              <w:rPr>
-                <w:rStyle w:val="VerbatimChar"/>
-              </w:rPr>
-              <w:t xml:space="preserve">NOT_FIXED</w:t>
-            </w:r>
-            <w:r>
-              <w:t xml:space="preserve"> </w:t>
-            </w:r>
-            <w:r>
-              <w:t xml:space="preserve">/</w:t>
-            </w:r>
-            <w:r>
-              <w:t xml:space="preserve"> </w:t>
-            </w:r>
-            <w:r>
-              <w:rPr>
-                <w:rStyle w:val="VerbatimChar"/>
-              </w:rPr>
-              <w:t xml:space="preserve">CHANGED</w:t>
-            </w:r>
-          </w:p>
-        </w:tc>
-        <w:tc>
-          <w:tcPr/>
-          <w:p>
-            <w:pPr>
-              <w:pStyle w:val="Compact"/>
-            </w:pPr>
-            <w:r>
-              <w:t xml:space="preserve">Giáo viên đánh giá lỗi của lần nộp</w:t>
-            </w:r>
-            <w:r>
-              <w:t xml:space="preserve"> </w:t>
-            </w:r>
-            <w:r>
-              <w:rPr>
-                <w:b/>
-                <w:bCs/>
-              </w:rPr>
-              <w:t xml:space="preserve">cũ</w:t>
-            </w:r>
-            <w:r>
-              <w:t xml:space="preserve"> </w:t>
-            </w:r>
-            <w:r>
-              <w:t xml:space="preserve">khi so sánh với lần sau: đã sửa / chưa sửa / đổi khác gợi ý.</w:t>
-            </w:r>
-            <w:r>
-              <w:t xml:space="preserve"> </w:t>
-            </w:r>
-            <w:r>
-              <w:rPr>
-                <w:rStyle w:val="VerbatimChar"/>
-              </w:rPr>
-              <w:t xml:space="preserve">NULL</w:t>
-            </w:r>
-            <w:r>
-              <w:t xml:space="preserve"> </w:t>
-            </w:r>
-            <w:r>
-              <w:t xml:space="preserve">= giao diện tự đoán bằng cách ghép đoạn trích</w:t>
-            </w:r>
-          </w:p>
-        </w:tc>
-      </w:tr>
-      <w:tr>
-        <w:tc>
-          <w:tcPr/>
-          <w:p>
-            <w:pPr>
-              <w:pStyle w:val="Compact"/>
-            </w:pPr>
-            <w:r>
               <w:t xml:space="preserve">created_at</w:t>
             </w:r>
           </w:p>
@@ -9949,10 +9268,19 @@
         <w:t xml:space="preserve">chk_inline_has_content</w:t>
       </w:r>
       <w:r>
+        <w:t xml:space="preserve">: có ít nhất một trong</w:t>
+      </w:r>
+      <w:r>
         <w:t xml:space="preserve"> </w:t>
       </w:r>
       <w:r>
-        <w:t xml:space="preserve">(V10): lỗi phải có ít nhất một trong</w:t>
+        <w:rPr>
+          <w:rStyle w:val="VerbatimChar"/>
+        </w:rPr>
+        <w:t xml:space="preserve">error_code</w:t>
+      </w:r>
+      <w:r>
+        <w:t xml:space="preserve">,</w:t>
       </w:r>
       <w:r>
         <w:t xml:space="preserve"> </w:t>
@@ -9961,7 +9289,7 @@
         <w:rPr>
           <w:rStyle w:val="VerbatimChar"/>
         </w:rPr>
-        <w:t xml:space="preserve">error_code</w:t>
+        <w:t xml:space="preserve">comment</w:t>
       </w:r>
       <w:r>
         <w:t xml:space="preserve">,</w:t>
@@ -9973,118 +9301,13 @@
         <w:rPr>
           <w:rStyle w:val="VerbatimChar"/>
         </w:rPr>
-        <w:t xml:space="preserve">comment</w:t>
-      </w:r>
-      <w:r>
-        <w:t xml:space="preserve">,</w:t>
+        <w:t xml:space="preserve">suggestion</w:t>
       </w:r>
       <w:r>
         <w:t xml:space="preserve"> </w:t>
       </w:r>
       <w:r>
-        <w:rPr>
-          <w:rStyle w:val="VerbatimChar"/>
-        </w:rPr>
-        <w:t xml:space="preserve">suggestion</w:t>
-      </w:r>
-      <w:r>
-        <w:t xml:space="preserve">,</w:t>
-      </w:r>
-      <w:r>
-        <w:t xml:space="preserve"> </w:t>
-      </w:r>
-      <w:r>
-        <w:rPr>
-          <w:rStyle w:val="VerbatimChar"/>
-        </w:rPr>
-        <w:t xml:space="preserve">edit</w:t>
-      </w:r>
-      <w:r>
-        <w:t xml:space="preserve"> </w:t>
-      </w:r>
-      <w:r>
-        <w:t xml:space="preserve">(BR-21);</w:t>
-      </w:r>
-      <w:r>
-        <w:t xml:space="preserve"> </w:t>
-      </w:r>
-      <w:r>
-        <w:rPr>
-          <w:rStyle w:val="VerbatimChar"/>
-        </w:rPr>
-        <w:t xml:space="preserve">COMMENT</w:t>
-      </w:r>
-      <w:r>
-        <w:t xml:space="preserve"> </w:t>
-      </w:r>
-      <w:r>
-        <w:t xml:space="preserve">phải có</w:t>
-      </w:r>
-      <w:r>
-        <w:t xml:space="preserve"> </w:t>
-      </w:r>
-      <w:r>
-        <w:rPr>
-          <w:rStyle w:val="VerbatimChar"/>
-        </w:rPr>
-        <w:t xml:space="preserve">comment</w:t>
-      </w:r>
-      <w:r>
-        <w:t xml:space="preserve">;</w:t>
-      </w:r>
-      <w:r>
-        <w:t xml:space="preserve"> </w:t>
-      </w:r>
-      <w:r>
-        <w:rPr>
-          <w:rStyle w:val="VerbatimChar"/>
-        </w:rPr>
-        <w:t xml:space="preserve">REPLACE</w:t>
-      </w:r>
-      <w:r>
-        <w:t xml:space="preserve"> </w:t>
-      </w:r>
-      <w:r>
-        <w:t xml:space="preserve">/</w:t>
-      </w:r>
-      <w:r>
-        <w:t xml:space="preserve"> </w:t>
-      </w:r>
-      <w:r>
-        <w:rPr>
-          <w:rStyle w:val="VerbatimChar"/>
-        </w:rPr>
-        <w:t xml:space="preserve">INSERT</w:t>
-      </w:r>
-      <w:r>
-        <w:t xml:space="preserve"> </w:t>
-      </w:r>
-      <w:r>
-        <w:t xml:space="preserve">phải có</w:t>
-      </w:r>
-      <w:r>
-        <w:t xml:space="preserve"> </w:t>
-      </w:r>
-      <w:r>
-        <w:rPr>
-          <w:rStyle w:val="VerbatimChar"/>
-        </w:rPr>
-        <w:t xml:space="preserve">suggestion</w:t>
-      </w:r>
-      <w:r>
-        <w:t xml:space="preserve">; lưu ý / dùng hay được để trống (chỉ tô màu).</w:t>
-      </w:r>
-    </w:p>
-    <w:p>
-      <w:pPr>
-        <w:pStyle w:val="Compact"/>
-        <w:numPr>
-          <w:ilvl w:val="0"/>
-          <w:numId w:val="1003"/>
-        </w:numPr>
-      </w:pPr>
-      <w:r>
-        <w:t xml:space="preserve">Không lưu prefix / suffix của đoạn trích: khi so sánh 2 lần nộp, giao diện lấy từ nội dung lần nộp cũ (bất biến) theo offset.</w:t>
+        <w:t xml:space="preserve">(BR-21).</w:t>
       </w:r>
     </w:p>
     <w:bookmarkEnd w:id="54"/>
@@ -10721,34 +9944,7 @@
         <w:t xml:space="preserve"> </w:t>
       </w:r>
       <w:r>
-        <w:t xml:space="preserve">mục 4.3 (V5), thêm</w:t>
-      </w:r>
-      <w:r>
-        <w:t xml:space="preserve"> </w:t>
-      </w:r>
-      <w:r>
-        <w:rPr>
-          <w:rStyle w:val="VerbatimChar"/>
-        </w:rPr>
-        <w:t xml:space="preserve">GR</w:t>
-      </w:r>
-      <w:r>
-        <w:t xml:space="preserve">,</w:t>
-      </w:r>
-      <w:r>
-        <w:t xml:space="preserve"> </w:t>
-      </w:r>
-      <w:r>
-        <w:rPr>
-          <w:rStyle w:val="VerbatimChar"/>
-        </w:rPr>
-        <w:t xml:space="preserve">OTHER</w:t>
-      </w:r>
-      <w:r>
-        <w:t xml:space="preserve"> </w:t>
-      </w:r>
-      <w:r>
-        <w:t xml:space="preserve">ở V9.</w:t>
+        <w:t xml:space="preserve">mục 4.3.</w:t>
       </w:r>
     </w:p>
     <w:bookmarkEnd w:id="55"/>
@@ -13190,13 +12386,13 @@
     </w:p>
     <w:bookmarkEnd w:id="62"/>
     <w:bookmarkEnd w:id="63"/>
-    <w:bookmarkStart w:id="64" w:name="Xde7190028ce23d571b15c62522dffdcbbda96ff"/>
+    <w:bookmarkStart w:id="64" w:name="X0f2bd21144d7a14dda88d1d55b50bf6de6ed029"/>
     <w:p>
       <w:pPr>
         <w:pStyle w:val="Heading3"/>
       </w:pPr>
       <w:r>
-        <w:t xml:space="preserve">4.7 Nhóm mở rộng (V11 trở đi, Mức 3)</w:t>
+        <w:t xml:space="preserve">4.7 Nhóm mở rộng (V9 trở đi, Mức 3)</w:t>
       </w:r>
     </w:p>
     <w:tbl>

</xml_diff>

<commit_message>
Module kết quả và thống kê: band theo thời gian, trung bình theo tiêu chí, thống kê lớp và xếp hạng
</commit_message>
<xml_diff>
--- a/docx/04-erd.docx
+++ b/docx/04-erd.docx
@@ -1313,7 +1313,225 @@
               <w:rPr>
                 <w:rStyle w:val="VerbatimChar"/>
               </w:rPr>
-              <w:t xml:space="preserve">V9__…</w:t>
+              <w:t xml:space="preserve">V9__inline_comment_kind.sql</w:t>
+            </w:r>
+          </w:p>
+        </w:tc>
+        <w:tc>
+          <w:tcPr/>
+          <w:p>
+            <w:pPr>
+              <w:pStyle w:val="Compact"/>
+            </w:pPr>
+            <w:r>
+              <w:t xml:space="preserve">Mức 2 / F5b</w:t>
+            </w:r>
+          </w:p>
+        </w:tc>
+        <w:tc>
+          <w:tcPr/>
+          <w:p>
+            <w:pPr>
+              <w:pStyle w:val="Compact"/>
+            </w:pPr>
+            <w:r>
+              <w:rPr>
+                <w:rStyle w:val="VerbatimChar"/>
+              </w:rPr>
+              <w:t xml:space="preserve">inline_comments.kind</w:t>
+            </w:r>
+            <w:r>
+              <w:t xml:space="preserve"> </w:t>
+            </w:r>
+            <w:r>
+              <w:t xml:space="preserve">(lỗi / lưu ý / dùng hay),</w:t>
+            </w:r>
+            <w:r>
+              <w:t xml:space="preserve"> </w:t>
+            </w:r>
+            <w:r>
+              <w:rPr>
+                <w:rStyle w:val="VerbatimChar"/>
+              </w:rPr>
+              <w:t xml:space="preserve">inline_comments.resolution</w:t>
+            </w:r>
+            <w:r>
+              <w:t xml:space="preserve"> </w:t>
+            </w:r>
+            <w:r>
+              <w:t xml:space="preserve">(đánh giá đã sửa khi so sánh 2 lần nộp); nới CK</w:t>
+            </w:r>
+            <w:r>
+              <w:t xml:space="preserve"> </w:t>
+            </w:r>
+            <w:r>
+              <w:rPr>
+                <w:rStyle w:val="VerbatimChar"/>
+              </w:rPr>
+              <w:t xml:space="preserve">chk_inline_has_content</w:t>
+            </w:r>
+            <w:r>
+              <w:t xml:space="preserve"> </w:t>
+            </w:r>
+            <w:r>
+              <w:t xml:space="preserve">cho lưu ý / dùng hay; thêm mã hệ thống</w:t>
+            </w:r>
+            <w:r>
+              <w:t xml:space="preserve"> </w:t>
+            </w:r>
+            <w:r>
+              <w:rPr>
+                <w:rStyle w:val="VerbatimChar"/>
+              </w:rPr>
+              <w:t xml:space="preserve">GR</w:t>
+            </w:r>
+            <w:r>
+              <w:t xml:space="preserve">,</w:t>
+            </w:r>
+            <w:r>
+              <w:t xml:space="preserve"> </w:t>
+            </w:r>
+            <w:r>
+              <w:rPr>
+                <w:rStyle w:val="VerbatimChar"/>
+              </w:rPr>
+              <w:t xml:space="preserve">OTHER</w:t>
+            </w:r>
+          </w:p>
+        </w:tc>
+        <w:tc>
+          <w:tcPr/>
+          <w:p>
+            <w:pPr>
+              <w:pStyle w:val="Compact"/>
+            </w:pPr>
+            <w:r>
+              <w:t xml:space="preserve">✅ đã viết</w:t>
+            </w:r>
+          </w:p>
+        </w:tc>
+      </w:tr>
+      <w:tr>
+        <w:tc>
+          <w:tcPr/>
+          <w:p>
+            <w:pPr>
+              <w:pStyle w:val="Compact"/>
+            </w:pPr>
+            <w:r>
+              <w:rPr>
+                <w:rStyle w:val="VerbatimChar"/>
+              </w:rPr>
+              <w:t xml:space="preserve">V10__inline_comment_edit.sql</w:t>
+            </w:r>
+          </w:p>
+        </w:tc>
+        <w:tc>
+          <w:tcPr/>
+          <w:p>
+            <w:pPr>
+              <w:pStyle w:val="Compact"/>
+            </w:pPr>
+            <w:r>
+              <w:t xml:space="preserve">Mức 2 / F5b</w:t>
+            </w:r>
+          </w:p>
+        </w:tc>
+        <w:tc>
+          <w:tcPr/>
+          <w:p>
+            <w:pPr>
+              <w:pStyle w:val="Compact"/>
+            </w:pPr>
+            <w:r>
+              <w:rPr>
+                <w:rStyle w:val="VerbatimChar"/>
+              </w:rPr>
+              <w:t xml:space="preserve">inline_comments.edit</w:t>
+            </w:r>
+            <w:r>
+              <w:t xml:space="preserve"> </w:t>
+            </w:r>
+            <w:r>
+              <w:t xml:space="preserve">(REPLACE / DELETE / INSERT — sửa kiểu track changes),</w:t>
+            </w:r>
+            <w:r>
+              <w:t xml:space="preserve"> </w:t>
+            </w:r>
+            <w:r>
+              <w:rPr>
+                <w:rStyle w:val="VerbatimChar"/>
+              </w:rPr>
+              <w:t xml:space="preserve">kind</w:t>
+            </w:r>
+            <w:r>
+              <w:t xml:space="preserve"> </w:t>
+            </w:r>
+            <w:r>
+              <w:t xml:space="preserve">thêm</w:t>
+            </w:r>
+            <w:r>
+              <w:t xml:space="preserve"> </w:t>
+            </w:r>
+            <w:r>
+              <w:rPr>
+                <w:rStyle w:val="VerbatimChar"/>
+              </w:rPr>
+              <w:t xml:space="preserve">COMMENT</w:t>
+            </w:r>
+            <w:r>
+              <w:t xml:space="preserve">; CK</w:t>
+            </w:r>
+            <w:r>
+              <w:t xml:space="preserve"> </w:t>
+            </w:r>
+            <w:r>
+              <w:rPr>
+                <w:rStyle w:val="VerbatimChar"/>
+              </w:rPr>
+              <w:t xml:space="preserve">chk_inline_has_content</w:t>
+            </w:r>
+            <w:r>
+              <w:t xml:space="preserve"> </w:t>
+            </w:r>
+            <w:r>
+              <w:t xml:space="preserve">tính cả</w:t>
+            </w:r>
+            <w:r>
+              <w:t xml:space="preserve"> </w:t>
+            </w:r>
+            <w:r>
+              <w:rPr>
+                <w:rStyle w:val="VerbatimChar"/>
+              </w:rPr>
+              <w:t xml:space="preserve">edit</w:t>
+            </w:r>
+          </w:p>
+        </w:tc>
+        <w:tc>
+          <w:tcPr/>
+          <w:p>
+            <w:pPr>
+              <w:pStyle w:val="Compact"/>
+            </w:pPr>
+            <w:r>
+              <w:t xml:space="preserve">✅ đã viết</w:t>
+            </w:r>
+          </w:p>
+        </w:tc>
+      </w:tr>
+      <w:tr>
+        <w:tc>
+          <w:tcPr/>
+          <w:p>
+            <w:pPr>
+              <w:pStyle w:val="Compact"/>
+            </w:pPr>
+            <w:r>
+              <w:rPr>
+                <w:rStyle w:val="VerbatimChar"/>
+              </w:rPr>
+              <w:t xml:space="preserve">V11__…</w:t>
             </w:r>
             <w:r>
               <w:t xml:space="preserve"> </w:t>
@@ -1384,7 +1602,7 @@
         <w:pStyle w:val="BlockText"/>
       </w:pPr>
       <w:r>
-        <w:t xml:space="preserve">Lộ trình đã đánh số lại sau khi nghiên cứu nghiệp vụ chấm IELTS (tài liệu 08). Ở bước 12, migration Mức 2 (trước gộp trong V6) được tách theo từng bước — V6 audit, V7 chat, V8 bản nháp — để mỗi bước tự chứa bảng và entity của mình; Mức 3 dời sang V9 trở đi. Mô tả cột chi tiết ở mục 4 sẽ được bổ sung khi viết từng migration.</w:t>
+        <w:t xml:space="preserve">Lộ trình đã đánh số lại sau khi nghiên cứu nghiệp vụ chấm IELTS (tài liệu 08). Ở bước 12, migration Mức 2 (trước gộp trong V6) được tách theo từng bước — V6 audit, V7 chat, V8 bản nháp — để mỗi bước tự chứa bảng và entity của mình; Mức 3 dời sang V9 trở đi, rồi V11 trở đi khi V9, V10 dùng cho đánh dấu trên bài (F5b). Mô tả cột chi tiết ở mục 4 sẽ được bổ sung khi viết từng migration.</w:t>
       </w:r>
     </w:p>
     <w:p>
@@ -1542,7 +1760,7 @@
       <w:r>
         <w:drawing>
           <wp:inline>
-            <wp:extent cx="5334000" cy="4850946"/>
+            <wp:extent cx="5334000" cy="5143500"/>
             <wp:effectExtent b="0" l="0" r="0" t="0"/>
             <wp:docPr descr="Hình 04.3" title="" id="23" name="Picture"/>
             <a:graphic>
@@ -1563,7 +1781,7 @@
                   <pic:spPr bwMode="auto">
                     <a:xfrm>
                       <a:off x="0" y="0"/>
-                      <a:ext cx="5334000" cy="4850946"/>
+                      <a:ext cx="5334000" cy="5143500"/>
                     </a:xfrm>
                     <a:prstGeom prst="rect">
                       <a:avLst/>
@@ -4420,7 +4638,7 @@
       </w:r>
     </w:p>
     <w:bookmarkEnd w:id="41"/>
-    <w:bookmarkStart w:id="42" w:name="X25abd2114553b20084e34a658df9a9bf6057bc9"/>
+    <w:bookmarkStart w:id="42" w:name="X6a8235ae74c7a5af911d554f0ed35e5c8a9db88"/>
     <w:p>
       <w:pPr>
         <w:pStyle w:val="Heading4"/>
@@ -4435,7 +4653,7 @@
         <w:t xml:space="preserve"> </w:t>
       </w:r>
       <w:r>
-        <w:t xml:space="preserve">— các phần của bài (V1, V4, V9+)</w:t>
+        <w:t xml:space="preserve">— các phần của bài (V1, V4, V11+)</w:t>
       </w:r>
     </w:p>
     <w:tbl>
@@ -5022,7 +5240,7 @@
               <w:pStyle w:val="Compact"/>
             </w:pPr>
             <w:r>
-              <w:t xml:space="preserve">(V9+, Mức 3) DF false</w:t>
+              <w:t xml:space="preserve">(V11+, Mức 3) DF false</w:t>
             </w:r>
           </w:p>
         </w:tc>
@@ -5068,7 +5286,7 @@
               <w:pStyle w:val="Compact"/>
             </w:pPr>
             <w:r>
-              <w:t xml:space="preserve">(V9+, Mức 3)</w:t>
+              <w:t xml:space="preserve">(V10+, Mức 3)</w:t>
             </w:r>
           </w:p>
         </w:tc>
@@ -8719,7 +8937,7 @@
       </w:r>
     </w:p>
     <w:bookmarkEnd w:id="53"/>
-    <w:bookmarkStart w:id="54" w:name="Xc3cd27b674b30357a665d098a80832b3f866b46"/>
+    <w:bookmarkStart w:id="54" w:name="X1610e5b598e8d95e27626031f5256a1d9544189"/>
     <w:p>
       <w:pPr>
         <w:pStyle w:val="Heading4"/>
@@ -8734,7 +8952,7 @@
         <w:t xml:space="preserve"> </w:t>
       </w:r>
       <w:r>
-        <w:t xml:space="preserve">— nhận xét gắn vào đoạn văn (V1, V5)</w:t>
+        <w:t xml:space="preserve">— nhận xét gắn vào đoạn văn (V1, V5, V9, V10)</w:t>
       </w:r>
     </w:p>
     <w:tbl>
@@ -9199,6 +9417,469 @@
               <w:pStyle w:val="Compact"/>
             </w:pPr>
             <w:r>
+              <w:t xml:space="preserve">kind</w:t>
+            </w:r>
+          </w:p>
+        </w:tc>
+        <w:tc>
+          <w:tcPr/>
+          <w:p>
+            <w:pPr>
+              <w:pStyle w:val="Compact"/>
+            </w:pPr>
+            <w:r>
+              <w:t xml:space="preserve">VARCHAR(10)</w:t>
+            </w:r>
+          </w:p>
+        </w:tc>
+        <w:tc>
+          <w:tcPr/>
+          <w:p>
+            <w:pPr>
+              <w:pStyle w:val="Compact"/>
+            </w:pPr>
+            <w:r>
+              <w:t xml:space="preserve">(V9, V10) NN, DF</w:t>
+            </w:r>
+            <w:r>
+              <w:t xml:space="preserve"> </w:t>
+            </w:r>
+            <w:r>
+              <w:rPr>
+                <w:rStyle w:val="VerbatimChar"/>
+              </w:rPr>
+              <w:t xml:space="preserve">ERROR</w:t>
+            </w:r>
+            <w:r>
+              <w:t xml:space="preserve">, CK</w:t>
+            </w:r>
+            <w:r>
+              <w:t xml:space="preserve"> </w:t>
+            </w:r>
+            <w:r>
+              <w:rPr>
+                <w:rStyle w:val="VerbatimChar"/>
+              </w:rPr>
+              <w:t xml:space="preserve">ERROR</w:t>
+            </w:r>
+            <w:r>
+              <w:t xml:space="preserve"> </w:t>
+            </w:r>
+            <w:r>
+              <w:t xml:space="preserve">/</w:t>
+            </w:r>
+            <w:r>
+              <w:t xml:space="preserve"> </w:t>
+            </w:r>
+            <w:r>
+              <w:rPr>
+                <w:rStyle w:val="VerbatimChar"/>
+              </w:rPr>
+              <w:t xml:space="preserve">HIGHLIGHT</w:t>
+            </w:r>
+            <w:r>
+              <w:t xml:space="preserve"> </w:t>
+            </w:r>
+            <w:r>
+              <w:t xml:space="preserve">/</w:t>
+            </w:r>
+            <w:r>
+              <w:t xml:space="preserve"> </w:t>
+            </w:r>
+            <w:r>
+              <w:rPr>
+                <w:rStyle w:val="VerbatimChar"/>
+              </w:rPr>
+              <w:t xml:space="preserve">GOOD</w:t>
+            </w:r>
+            <w:r>
+              <w:t xml:space="preserve"> </w:t>
+            </w:r>
+            <w:r>
+              <w:t xml:space="preserve">/</w:t>
+            </w:r>
+            <w:r>
+              <w:t xml:space="preserve"> </w:t>
+            </w:r>
+            <w:r>
+              <w:rPr>
+                <w:rStyle w:val="VerbatimChar"/>
+              </w:rPr>
+              <w:t xml:space="preserve">COMMENT</w:t>
+            </w:r>
+          </w:p>
+        </w:tc>
+        <w:tc>
+          <w:tcPr/>
+          <w:p>
+            <w:pPr>
+              <w:pStyle w:val="Compact"/>
+            </w:pPr>
+            <w:r>
+              <w:t xml:space="preserve">Kiểu đánh dấu: lỗi (gạch gợn sóng) / lưu ý (vàng) / dùng hay (xanh) / nhận xét (xám, V10). Chỉ</w:t>
+            </w:r>
+            <w:r>
+              <w:t xml:space="preserve"> </w:t>
+            </w:r>
+            <w:r>
+              <w:rPr>
+                <w:rStyle w:val="VerbatimChar"/>
+              </w:rPr>
+              <w:t xml:space="preserve">ERROR</w:t>
+            </w:r>
+            <w:r>
+              <w:t xml:space="preserve"> </w:t>
+            </w:r>
+            <w:r>
+              <w:t xml:space="preserve">được tính vào thống kê lỗi; kiểu khác không mang mã lỗi (trừ mã khen);</w:t>
+            </w:r>
+            <w:r>
+              <w:t xml:space="preserve"> </w:t>
+            </w:r>
+            <w:r>
+              <w:rPr>
+                <w:rStyle w:val="VerbatimChar"/>
+              </w:rPr>
+              <w:t xml:space="preserve">COMMENT</w:t>
+            </w:r>
+            <w:r>
+              <w:t xml:space="preserve"> </w:t>
+            </w:r>
+            <w:r>
+              <w:t xml:space="preserve">phải có</w:t>
+            </w:r>
+            <w:r>
+              <w:t xml:space="preserve"> </w:t>
+            </w:r>
+            <w:r>
+              <w:rPr>
+                <w:rStyle w:val="VerbatimChar"/>
+              </w:rPr>
+              <w:t xml:space="preserve">comment</w:t>
+            </w:r>
+          </w:p>
+        </w:tc>
+      </w:tr>
+      <w:tr>
+        <w:tc>
+          <w:tcPr/>
+          <w:p>
+            <w:pPr>
+              <w:pStyle w:val="Compact"/>
+            </w:pPr>
+            <w:r>
+              <w:t xml:space="preserve">edit</w:t>
+            </w:r>
+          </w:p>
+        </w:tc>
+        <w:tc>
+          <w:tcPr/>
+          <w:p>
+            <w:pPr>
+              <w:pStyle w:val="Compact"/>
+            </w:pPr>
+            <w:r>
+              <w:t xml:space="preserve">VARCHAR(10)</w:t>
+            </w:r>
+          </w:p>
+        </w:tc>
+        <w:tc>
+          <w:tcPr/>
+          <w:p>
+            <w:pPr>
+              <w:pStyle w:val="Compact"/>
+            </w:pPr>
+            <w:r>
+              <w:t xml:space="preserve">(V10) CK</w:t>
+            </w:r>
+            <w:r>
+              <w:t xml:space="preserve"> </w:t>
+            </w:r>
+            <w:r>
+              <w:rPr>
+                <w:rStyle w:val="VerbatimChar"/>
+              </w:rPr>
+              <w:t xml:space="preserve">REPLACE</w:t>
+            </w:r>
+            <w:r>
+              <w:t xml:space="preserve"> </w:t>
+            </w:r>
+            <w:r>
+              <w:t xml:space="preserve">/</w:t>
+            </w:r>
+            <w:r>
+              <w:t xml:space="preserve"> </w:t>
+            </w:r>
+            <w:r>
+              <w:rPr>
+                <w:rStyle w:val="VerbatimChar"/>
+              </w:rPr>
+              <w:t xml:space="preserve">DELETE</w:t>
+            </w:r>
+            <w:r>
+              <w:t xml:space="preserve"> </w:t>
+            </w:r>
+            <w:r>
+              <w:t xml:space="preserve">/</w:t>
+            </w:r>
+            <w:r>
+              <w:t xml:space="preserve"> </w:t>
+            </w:r>
+            <w:r>
+              <w:rPr>
+                <w:rStyle w:val="VerbatimChar"/>
+              </w:rPr>
+              <w:t xml:space="preserve">INSERT</w:t>
+            </w:r>
+          </w:p>
+        </w:tc>
+        <w:tc>
+          <w:tcPr/>
+          <w:p>
+            <w:pPr>
+              <w:pStyle w:val="Compact"/>
+            </w:pPr>
+            <w:r>
+              <w:t xml:space="preserve">Sửa kiểu track changes, chỉ với</w:t>
+            </w:r>
+            <w:r>
+              <w:t xml:space="preserve"> </w:t>
+            </w:r>
+            <w:r>
+              <w:rPr>
+                <w:rStyle w:val="VerbatimChar"/>
+              </w:rPr>
+              <w:t xml:space="preserve">ERROR</w:t>
+            </w:r>
+            <w:r>
+              <w:t xml:space="preserve">:</w:t>
+            </w:r>
+            <w:r>
+              <w:t xml:space="preserve"> </w:t>
+            </w:r>
+            <w:r>
+              <w:rPr>
+                <w:rStyle w:val="VerbatimChar"/>
+              </w:rPr>
+              <w:t xml:space="preserve">REPLACE</w:t>
+            </w:r>
+            <w:r>
+              <w:t xml:space="preserve"> </w:t>
+            </w:r>
+            <w:r>
+              <w:t xml:space="preserve">/</w:t>
+            </w:r>
+            <w:r>
+              <w:t xml:space="preserve"> </w:t>
+            </w:r>
+            <w:r>
+              <w:rPr>
+                <w:rStyle w:val="VerbatimChar"/>
+              </w:rPr>
+              <w:t xml:space="preserve">INSERT</w:t>
+            </w:r>
+            <w:r>
+              <w:t xml:space="preserve"> </w:t>
+            </w:r>
+            <w:r>
+              <w:t xml:space="preserve">dùng</w:t>
+            </w:r>
+            <w:r>
+              <w:t xml:space="preserve"> </w:t>
+            </w:r>
+            <w:r>
+              <w:rPr>
+                <w:rStyle w:val="VerbatimChar"/>
+              </w:rPr>
+              <w:t xml:space="preserve">suggestion</w:t>
+            </w:r>
+            <w:r>
+              <w:t xml:space="preserve"> </w:t>
+            </w:r>
+            <w:r>
+              <w:t xml:space="preserve">làm chữ mới (bắt buộc),</w:t>
+            </w:r>
+            <w:r>
+              <w:t xml:space="preserve"> </w:t>
+            </w:r>
+            <w:r>
+              <w:rPr>
+                <w:rStyle w:val="VerbatimChar"/>
+              </w:rPr>
+              <w:t xml:space="preserve">DELETE</w:t>
+            </w:r>
+            <w:r>
+              <w:t xml:space="preserve"> </w:t>
+            </w:r>
+            <w:r>
+              <w:t xml:space="preserve">không có</w:t>
+            </w:r>
+            <w:r>
+              <w:t xml:space="preserve"> </w:t>
+            </w:r>
+            <w:r>
+              <w:rPr>
+                <w:rStyle w:val="VerbatimChar"/>
+              </w:rPr>
+              <w:t xml:space="preserve">suggestion</w:t>
+            </w:r>
+            <w:r>
+              <w:t xml:space="preserve">. Bản ghi cũ có</w:t>
+            </w:r>
+            <w:r>
+              <w:t xml:space="preserve"> </w:t>
+            </w:r>
+            <w:r>
+              <w:rPr>
+                <w:rStyle w:val="VerbatimChar"/>
+              </w:rPr>
+              <w:t xml:space="preserve">suggestion</w:t>
+            </w:r>
+            <w:r>
+              <w:t xml:space="preserve"> </w:t>
+            </w:r>
+            <w:r>
+              <w:t xml:space="preserve">được đặt</w:t>
+            </w:r>
+            <w:r>
+              <w:t xml:space="preserve"> </w:t>
+            </w:r>
+            <w:r>
+              <w:rPr>
+                <w:rStyle w:val="VerbatimChar"/>
+              </w:rPr>
+              <w:t xml:space="preserve">REPLACE</w:t>
+            </w:r>
+            <w:r>
+              <w:t xml:space="preserve">. Chữ gốc không đổi</w:t>
+            </w:r>
+          </w:p>
+        </w:tc>
+      </w:tr>
+      <w:tr>
+        <w:tc>
+          <w:tcPr/>
+          <w:p>
+            <w:pPr>
+              <w:pStyle w:val="Compact"/>
+            </w:pPr>
+            <w:r>
+              <w:t xml:space="preserve">resolution</w:t>
+            </w:r>
+          </w:p>
+        </w:tc>
+        <w:tc>
+          <w:tcPr/>
+          <w:p>
+            <w:pPr>
+              <w:pStyle w:val="Compact"/>
+            </w:pPr>
+            <w:r>
+              <w:t xml:space="preserve">VARCHAR(10)</w:t>
+            </w:r>
+          </w:p>
+        </w:tc>
+        <w:tc>
+          <w:tcPr/>
+          <w:p>
+            <w:pPr>
+              <w:pStyle w:val="Compact"/>
+            </w:pPr>
+            <w:r>
+              <w:t xml:space="preserve">(V9) CK</w:t>
+            </w:r>
+            <w:r>
+              <w:t xml:space="preserve"> </w:t>
+            </w:r>
+            <w:r>
+              <w:rPr>
+                <w:rStyle w:val="VerbatimChar"/>
+              </w:rPr>
+              <w:t xml:space="preserve">FIXED</w:t>
+            </w:r>
+            <w:r>
+              <w:t xml:space="preserve"> </w:t>
+            </w:r>
+            <w:r>
+              <w:t xml:space="preserve">/</w:t>
+            </w:r>
+            <w:r>
+              <w:t xml:space="preserve"> </w:t>
+            </w:r>
+            <w:r>
+              <w:rPr>
+                <w:rStyle w:val="VerbatimChar"/>
+              </w:rPr>
+              <w:t xml:space="preserve">NOT_FIXED</w:t>
+            </w:r>
+            <w:r>
+              <w:t xml:space="preserve"> </w:t>
+            </w:r>
+            <w:r>
+              <w:t xml:space="preserve">/</w:t>
+            </w:r>
+            <w:r>
+              <w:t xml:space="preserve"> </w:t>
+            </w:r>
+            <w:r>
+              <w:rPr>
+                <w:rStyle w:val="VerbatimChar"/>
+              </w:rPr>
+              <w:t xml:space="preserve">CHANGED</w:t>
+            </w:r>
+          </w:p>
+        </w:tc>
+        <w:tc>
+          <w:tcPr/>
+          <w:p>
+            <w:pPr>
+              <w:pStyle w:val="Compact"/>
+            </w:pPr>
+            <w:r>
+              <w:t xml:space="preserve">Giáo viên đánh giá lỗi của lần nộp</w:t>
+            </w:r>
+            <w:r>
+              <w:t xml:space="preserve"> </w:t>
+            </w:r>
+            <w:r>
+              <w:rPr>
+                <w:b/>
+                <w:bCs/>
+              </w:rPr>
+              <w:t xml:space="preserve">cũ</w:t>
+            </w:r>
+            <w:r>
+              <w:t xml:space="preserve"> </w:t>
+            </w:r>
+            <w:r>
+              <w:t xml:space="preserve">khi so sánh với lần sau: đã sửa / chưa sửa / đổi khác gợi ý.</w:t>
+            </w:r>
+            <w:r>
+              <w:t xml:space="preserve"> </w:t>
+            </w:r>
+            <w:r>
+              <w:rPr>
+                <w:rStyle w:val="VerbatimChar"/>
+              </w:rPr>
+              <w:t xml:space="preserve">NULL</w:t>
+            </w:r>
+            <w:r>
+              <w:t xml:space="preserve"> </w:t>
+            </w:r>
+            <w:r>
+              <w:t xml:space="preserve">= giao diện tự đoán bằng cách ghép đoạn trích</w:t>
+            </w:r>
+          </w:p>
+        </w:tc>
+      </w:tr>
+      <w:tr>
+        <w:tc>
+          <w:tcPr/>
+          <w:p>
+            <w:pPr>
+              <w:pStyle w:val="Compact"/>
+            </w:pPr>
+            <w:r>
               <w:t xml:space="preserve">created_at</w:t>
             </w:r>
           </w:p>
@@ -9268,7 +9949,10 @@
         <w:t xml:space="preserve">chk_inline_has_content</w:t>
       </w:r>
       <w:r>
-        <w:t xml:space="preserve">: có ít nhất một trong</w:t>
+        <w:t xml:space="preserve"> </w:t>
+      </w:r>
+      <w:r>
+        <w:t xml:space="preserve">(V10): lỗi phải có ít nhất một trong</w:t>
       </w:r>
       <w:r>
         <w:t xml:space="preserve"> </w:t>
@@ -9304,10 +9988,103 @@
         <w:t xml:space="preserve">suggestion</w:t>
       </w:r>
       <w:r>
-        <w:t xml:space="preserve"> </w:t>
-      </w:r>
-      <w:r>
-        <w:t xml:space="preserve">(BR-21).</w:t>
+        <w:t xml:space="preserve">,</w:t>
+      </w:r>
+      <w:r>
+        <w:t xml:space="preserve"> </w:t>
+      </w:r>
+      <w:r>
+        <w:rPr>
+          <w:rStyle w:val="VerbatimChar"/>
+        </w:rPr>
+        <w:t xml:space="preserve">edit</w:t>
+      </w:r>
+      <w:r>
+        <w:t xml:space="preserve"> </w:t>
+      </w:r>
+      <w:r>
+        <w:t xml:space="preserve">(BR-21);</w:t>
+      </w:r>
+      <w:r>
+        <w:t xml:space="preserve"> </w:t>
+      </w:r>
+      <w:r>
+        <w:rPr>
+          <w:rStyle w:val="VerbatimChar"/>
+        </w:rPr>
+        <w:t xml:space="preserve">COMMENT</w:t>
+      </w:r>
+      <w:r>
+        <w:t xml:space="preserve"> </w:t>
+      </w:r>
+      <w:r>
+        <w:t xml:space="preserve">phải có</w:t>
+      </w:r>
+      <w:r>
+        <w:t xml:space="preserve"> </w:t>
+      </w:r>
+      <w:r>
+        <w:rPr>
+          <w:rStyle w:val="VerbatimChar"/>
+        </w:rPr>
+        <w:t xml:space="preserve">comment</w:t>
+      </w:r>
+      <w:r>
+        <w:t xml:space="preserve">;</w:t>
+      </w:r>
+      <w:r>
+        <w:t xml:space="preserve"> </w:t>
+      </w:r>
+      <w:r>
+        <w:rPr>
+          <w:rStyle w:val="VerbatimChar"/>
+        </w:rPr>
+        <w:t xml:space="preserve">REPLACE</w:t>
+      </w:r>
+      <w:r>
+        <w:t xml:space="preserve"> </w:t>
+      </w:r>
+      <w:r>
+        <w:t xml:space="preserve">/</w:t>
+      </w:r>
+      <w:r>
+        <w:t xml:space="preserve"> </w:t>
+      </w:r>
+      <w:r>
+        <w:rPr>
+          <w:rStyle w:val="VerbatimChar"/>
+        </w:rPr>
+        <w:t xml:space="preserve">INSERT</w:t>
+      </w:r>
+      <w:r>
+        <w:t xml:space="preserve"> </w:t>
+      </w:r>
+      <w:r>
+        <w:t xml:space="preserve">phải có</w:t>
+      </w:r>
+      <w:r>
+        <w:t xml:space="preserve"> </w:t>
+      </w:r>
+      <w:r>
+        <w:rPr>
+          <w:rStyle w:val="VerbatimChar"/>
+        </w:rPr>
+        <w:t xml:space="preserve">suggestion</w:t>
+      </w:r>
+      <w:r>
+        <w:t xml:space="preserve">; lưu ý / dùng hay được để trống (chỉ tô màu).</w:t>
+      </w:r>
+    </w:p>
+    <w:p>
+      <w:pPr>
+        <w:pStyle w:val="Compact"/>
+        <w:numPr>
+          <w:ilvl w:val="0"/>
+          <w:numId w:val="1003"/>
+        </w:numPr>
+      </w:pPr>
+      <w:r>
+        <w:t xml:space="preserve">Không lưu prefix / suffix của đoạn trích: khi so sánh 2 lần nộp, giao diện lấy từ nội dung lần nộp cũ (bất biến) theo offset.</w:t>
       </w:r>
     </w:p>
     <w:bookmarkEnd w:id="54"/>
@@ -9944,7 +10721,34 @@
         <w:t xml:space="preserve"> </w:t>
       </w:r>
       <w:r>
-        <w:t xml:space="preserve">mục 4.3.</w:t>
+        <w:t xml:space="preserve">mục 4.3 (V5), thêm</w:t>
+      </w:r>
+      <w:r>
+        <w:t xml:space="preserve"> </w:t>
+      </w:r>
+      <w:r>
+        <w:rPr>
+          <w:rStyle w:val="VerbatimChar"/>
+        </w:rPr>
+        <w:t xml:space="preserve">GR</w:t>
+      </w:r>
+      <w:r>
+        <w:t xml:space="preserve">,</w:t>
+      </w:r>
+      <w:r>
+        <w:t xml:space="preserve"> </w:t>
+      </w:r>
+      <w:r>
+        <w:rPr>
+          <w:rStyle w:val="VerbatimChar"/>
+        </w:rPr>
+        <w:t xml:space="preserve">OTHER</w:t>
+      </w:r>
+      <w:r>
+        <w:t xml:space="preserve"> </w:t>
+      </w:r>
+      <w:r>
+        <w:t xml:space="preserve">ở V9.</w:t>
       </w:r>
     </w:p>
     <w:bookmarkEnd w:id="55"/>
@@ -12386,13 +13190,13 @@
     </w:p>
     <w:bookmarkEnd w:id="62"/>
     <w:bookmarkEnd w:id="63"/>
-    <w:bookmarkStart w:id="64" w:name="X0f2bd21144d7a14dda88d1d55b50bf6de6ed029"/>
+    <w:bookmarkStart w:id="64" w:name="Xde7190028ce23d571b15c62522dffdcbbda96ff"/>
     <w:p>
       <w:pPr>
         <w:pStyle w:val="Heading3"/>
       </w:pPr>
       <w:r>
-        <w:t xml:space="preserve">4.7 Nhóm mở rộng (V9 trở đi, Mức 3)</w:t>
+        <w:t xml:space="preserve">4.7 Nhóm mở rộng (V11 trở đi, Mức 3)</w:t>
       </w:r>
     </w:p>
     <w:tbl>

</xml_diff>

<commit_message>
Hoàn thiện hệ thống: điều hướng bài tập, phiên đăng nhập, bố cục Paper, nhận xét Paper realtime, thống kê mở rộng (H1–H5)
- H1: đầu trang + tab chung cho Chi tiết / Nhóm / Tiến độ / Giám sát / Thống kê; gom thao tác vào menu
- H2: API admin xem / thu hồi / dọn phiên đăng nhập, ghi nhật ký; trang quản trị dạng bảng có lọc
- H3: bố cục 2 cột màn làm Paper, thanh trạng thái đồng bộ, hiện thành viên đang soạn
- H4: giáo viên bôi đen để nhận xét / chỉ lỗi / gợi ý sửa trên tài liệu nhóm, đẩy realtime (V23)
- H5: API thống kê tổng hợp có bộ lọc + xuất CSV/Excel; dashboard admin và giáo viên
- Xoá file prompt và ảnh tham chiếu; cập nhật docs, Word, PROGRESS

Co-Authored-By: Claude Opus 5.5 <noreply@anthropic.com>
</commit_message>
<xml_diff>
--- a/docx/04-erd.docx
+++ b/docx/04-erd.docx
@@ -2577,7 +2577,180 @@
               <w:rPr>
                 <w:rStyle w:val="VerbatimChar"/>
               </w:rPr>
-              <w:t xml:space="preserve">V22__…</w:t>
+              <w:t xml:space="preserve">V22__paper_live_comments.sql</w:t>
+            </w:r>
+          </w:p>
+        </w:tc>
+        <w:tc>
+          <w:tcPr/>
+          <w:p>
+            <w:pPr>
+              <w:pStyle w:val="Compact"/>
+            </w:pPr>
+            <w:r>
+              <w:t xml:space="preserve">Mức 1 mở rộng</w:t>
+            </w:r>
+          </w:p>
+        </w:tc>
+        <w:tc>
+          <w:tcPr/>
+          <w:p>
+            <w:pPr>
+              <w:pStyle w:val="Compact"/>
+            </w:pPr>
+            <w:r>
+              <w:rPr>
+                <w:rStyle w:val="VerbatimChar"/>
+              </w:rPr>
+              <w:t xml:space="preserve">paper_live_comments</w:t>
+            </w:r>
+            <w:r>
+              <w:t xml:space="preserve">: nhận xét tạm thời của giáo viên trên đoạn văn Paper đang viết</w:t>
+            </w:r>
+          </w:p>
+        </w:tc>
+        <w:tc>
+          <w:tcPr/>
+          <w:p>
+            <w:pPr>
+              <w:pStyle w:val="Compact"/>
+            </w:pPr>
+            <w:r>
+              <w:t xml:space="preserve">✅ đã viết</w:t>
+            </w:r>
+          </w:p>
+        </w:tc>
+      </w:tr>
+      <w:tr>
+        <w:tc>
+          <w:tcPr/>
+          <w:p>
+            <w:pPr>
+              <w:pStyle w:val="Compact"/>
+            </w:pPr>
+            <w:r>
+              <w:rPr>
+                <w:rStyle w:val="VerbatimChar"/>
+              </w:rPr>
+              <w:t xml:space="preserve">V23__paper_live_comment_kind.sql</w:t>
+            </w:r>
+          </w:p>
+        </w:tc>
+        <w:tc>
+          <w:tcPr/>
+          <w:p>
+            <w:pPr>
+              <w:pStyle w:val="Compact"/>
+            </w:pPr>
+            <w:r>
+              <w:t xml:space="preserve">H4</w:t>
+            </w:r>
+          </w:p>
+        </w:tc>
+        <w:tc>
+          <w:tcPr/>
+          <w:p>
+            <w:pPr>
+              <w:pStyle w:val="Compact"/>
+            </w:pPr>
+            <w:r>
+              <w:rPr>
+                <w:rStyle w:val="VerbatimChar"/>
+              </w:rPr>
+              <w:t xml:space="preserve">paper_live_comments</w:t>
+            </w:r>
+            <w:r>
+              <w:t xml:space="preserve"> </w:t>
+            </w:r>
+            <w:r>
+              <w:t xml:space="preserve">thêm</w:t>
+            </w:r>
+            <w:r>
+              <w:t xml:space="preserve"> </w:t>
+            </w:r>
+            <w:r>
+              <w:rPr>
+                <w:rStyle w:val="VerbatimChar"/>
+              </w:rPr>
+              <w:t xml:space="preserve">kind</w:t>
+            </w:r>
+            <w:r>
+              <w:t xml:space="preserve"> </w:t>
+            </w:r>
+            <w:r>
+              <w:t xml:space="preserve">(6 loại phản hồi),</w:t>
+            </w:r>
+            <w:r>
+              <w:t xml:space="preserve"> </w:t>
+            </w:r>
+            <w:r>
+              <w:rPr>
+                <w:rStyle w:val="VerbatimChar"/>
+              </w:rPr>
+              <w:t xml:space="preserve">suggestion</w:t>
+            </w:r>
+            <w:r>
+              <w:t xml:space="preserve">,</w:t>
+            </w:r>
+            <w:r>
+              <w:t xml:space="preserve"> </w:t>
+            </w:r>
+            <w:r>
+              <w:rPr>
+                <w:rStyle w:val="VerbatimChar"/>
+              </w:rPr>
+              <w:t xml:space="preserve">section_key</w:t>
+            </w:r>
+            <w:r>
+              <w:t xml:space="preserve">,</w:t>
+            </w:r>
+            <w:r>
+              <w:t xml:space="preserve"> </w:t>
+            </w:r>
+            <w:r>
+              <w:rPr>
+                <w:rStyle w:val="VerbatimChar"/>
+              </w:rPr>
+              <w:t xml:space="preserve">resolved_at</w:t>
+            </w:r>
+            <w:r>
+              <w:t xml:space="preserve">,</w:t>
+            </w:r>
+            <w:r>
+              <w:t xml:space="preserve"> </w:t>
+            </w:r>
+            <w:r>
+              <w:rPr>
+                <w:rStyle w:val="VerbatimChar"/>
+              </w:rPr>
+              <w:t xml:space="preserve">resolved_by</w:t>
+            </w:r>
+          </w:p>
+        </w:tc>
+        <w:tc>
+          <w:tcPr/>
+          <w:p>
+            <w:pPr>
+              <w:pStyle w:val="Compact"/>
+            </w:pPr>
+            <w:r>
+              <w:t xml:space="preserve">✅ đã viết</w:t>
+            </w:r>
+          </w:p>
+        </w:tc>
+      </w:tr>
+      <w:tr>
+        <w:tc>
+          <w:tcPr/>
+          <w:p>
+            <w:pPr>
+              <w:pStyle w:val="Compact"/>
+            </w:pPr>
+            <w:r>
+              <w:rPr>
+                <w:rStyle w:val="VerbatimChar"/>
+              </w:rPr>
+              <w:t xml:space="preserve">V24__…</w:t>
             </w:r>
             <w:r>
               <w:t xml:space="preserve"> </w:t>
@@ -14860,6 +15033,42 @@
               <w:rPr>
                 <w:rStyle w:val="VerbatimChar"/>
               </w:rPr>
+              <w:t xml:space="preserve">REVOKE_SESSION</w:t>
+            </w:r>
+            <w:r>
+              <w:t xml:space="preserve">,</w:t>
+            </w:r>
+            <w:r>
+              <w:t xml:space="preserve"> </w:t>
+            </w:r>
+            <w:r>
+              <w:rPr>
+                <w:rStyle w:val="VerbatimChar"/>
+              </w:rPr>
+              <w:t xml:space="preserve">REVOKE_USER_SESSIONS</w:t>
+            </w:r>
+            <w:r>
+              <w:t xml:space="preserve">,</w:t>
+            </w:r>
+            <w:r>
+              <w:t xml:space="preserve"> </w:t>
+            </w:r>
+            <w:r>
+              <w:rPr>
+                <w:rStyle w:val="VerbatimChar"/>
+              </w:rPr>
+              <w:t xml:space="preserve">CLEANUP_SESSIONS</w:t>
+            </w:r>
+            <w:r>
+              <w:t xml:space="preserve">,</w:t>
+            </w:r>
+            <w:r>
+              <w:t xml:space="preserve"> </w:t>
+            </w:r>
+            <w:r>
+              <w:rPr>
+                <w:rStyle w:val="VerbatimChar"/>
+              </w:rPr>
               <w:t xml:space="preserve">IMPORT_STUDENTS</w:t>
             </w:r>
             <w:r>
@@ -16497,6 +16706,273 @@
             </w:r>
             <w:r>
               <w:t xml:space="preserve">. Chỉ INSERT</w:t>
+            </w:r>
+          </w:p>
+        </w:tc>
+      </w:tr>
+      <w:tr>
+        <w:tc>
+          <w:tcPr/>
+          <w:p>
+            <w:pPr>
+              <w:pStyle w:val="Compact"/>
+            </w:pPr>
+            <w:r>
+              <w:rPr>
+                <w:rStyle w:val="VerbatimChar"/>
+              </w:rPr>
+              <w:t xml:space="preserve">paper_live_comments</w:t>
+            </w:r>
+            <w:r>
+              <w:t xml:space="preserve"> </w:t>
+            </w:r>
+            <w:r>
+              <w:t xml:space="preserve">(V22, V23)</w:t>
+            </w:r>
+          </w:p>
+        </w:tc>
+        <w:tc>
+          <w:tcPr/>
+          <w:p>
+            <w:pPr>
+              <w:pStyle w:val="Compact"/>
+            </w:pPr>
+            <w:r>
+              <w:t xml:space="preserve">Nhận xét trực tiếp của giáo viên trên tài liệu Paper:</w:t>
+            </w:r>
+            <w:r>
+              <w:t xml:space="preserve"> </w:t>
+            </w:r>
+            <w:r>
+              <w:rPr>
+                <w:rStyle w:val="VerbatimChar"/>
+              </w:rPr>
+              <w:t xml:space="preserve">document_id</w:t>
+            </w:r>
+            <w:r>
+              <w:t xml:space="preserve">,</w:t>
+            </w:r>
+            <w:r>
+              <w:t xml:space="preserve"> </w:t>
+            </w:r>
+            <w:r>
+              <w:rPr>
+                <w:rStyle w:val="VerbatimChar"/>
+              </w:rPr>
+              <w:t xml:space="preserve">author_id</w:t>
+            </w:r>
+            <w:r>
+              <w:t xml:space="preserve">, đoạn chọn bằng</w:t>
+            </w:r>
+            <w:r>
+              <w:t xml:space="preserve"> </w:t>
+            </w:r>
+            <w:r>
+              <w:rPr>
+                <w:rStyle w:val="VerbatimChar"/>
+              </w:rPr>
+              <w:t xml:space="preserve">start_offset</w:t>
+            </w:r>
+            <w:r>
+              <w:t xml:space="preserve"> </w:t>
+            </w:r>
+            <w:r>
+              <w:t xml:space="preserve">/</w:t>
+            </w:r>
+            <w:r>
+              <w:t xml:space="preserve"> </w:t>
+            </w:r>
+            <w:r>
+              <w:rPr>
+                <w:rStyle w:val="VerbatimChar"/>
+              </w:rPr>
+              <w:t xml:space="preserve">end_offset</w:t>
+            </w:r>
+            <w:r>
+              <w:t xml:space="preserve">,</w:t>
+            </w:r>
+            <w:r>
+              <w:t xml:space="preserve"> </w:t>
+            </w:r>
+            <w:r>
+              <w:rPr>
+                <w:rStyle w:val="VerbatimChar"/>
+              </w:rPr>
+              <w:t xml:space="preserve">quote</w:t>
+            </w:r>
+            <w:r>
+              <w:t xml:space="preserve"> </w:t>
+            </w:r>
+            <w:r>
+              <w:t xml:space="preserve">bất biến,</w:t>
+            </w:r>
+            <w:r>
+              <w:t xml:space="preserve"> </w:t>
+            </w:r>
+            <w:r>
+              <w:rPr>
+                <w:rStyle w:val="VerbatimChar"/>
+              </w:rPr>
+              <w:t xml:space="preserve">comment</w:t>
+            </w:r>
+            <w:r>
+              <w:t xml:space="preserve">; V23 thêm</w:t>
+            </w:r>
+            <w:r>
+              <w:t xml:space="preserve"> </w:t>
+            </w:r>
+            <w:r>
+              <w:rPr>
+                <w:rStyle w:val="VerbatimChar"/>
+              </w:rPr>
+              <w:t xml:space="preserve">kind</w:t>
+            </w:r>
+            <w:r>
+              <w:t xml:space="preserve"> </w:t>
+            </w:r>
+            <w:r>
+              <w:t xml:space="preserve">(</w:t>
+            </w:r>
+            <w:r>
+              <w:rPr>
+                <w:rStyle w:val="VerbatimChar"/>
+              </w:rPr>
+              <w:t xml:space="preserve">COMMENT</w:t>
+            </w:r>
+            <w:r>
+              <w:t xml:space="preserve">,</w:t>
+            </w:r>
+            <w:r>
+              <w:t xml:space="preserve"> </w:t>
+            </w:r>
+            <w:r>
+              <w:rPr>
+                <w:rStyle w:val="VerbatimChar"/>
+              </w:rPr>
+              <w:t xml:space="preserve">GRAMMAR</w:t>
+            </w:r>
+            <w:r>
+              <w:t xml:space="preserve">,</w:t>
+            </w:r>
+            <w:r>
+              <w:t xml:space="preserve"> </w:t>
+            </w:r>
+            <w:r>
+              <w:rPr>
+                <w:rStyle w:val="VerbatimChar"/>
+              </w:rPr>
+              <w:t xml:space="preserve">VOCABULARY</w:t>
+            </w:r>
+            <w:r>
+              <w:t xml:space="preserve">,</w:t>
+            </w:r>
+            <w:r>
+              <w:t xml:space="preserve"> </w:t>
+            </w:r>
+            <w:r>
+              <w:rPr>
+                <w:rStyle w:val="VerbatimChar"/>
+              </w:rPr>
+              <w:t xml:space="preserve">COHERENCE</w:t>
+            </w:r>
+            <w:r>
+              <w:t xml:space="preserve">,</w:t>
+            </w:r>
+            <w:r>
+              <w:t xml:space="preserve"> </w:t>
+            </w:r>
+            <w:r>
+              <w:rPr>
+                <w:rStyle w:val="VerbatimChar"/>
+              </w:rPr>
+              <w:t xml:space="preserve">CITATION</w:t>
+            </w:r>
+            <w:r>
+              <w:t xml:space="preserve">,</w:t>
+            </w:r>
+            <w:r>
+              <w:t xml:space="preserve"> </w:t>
+            </w:r>
+            <w:r>
+              <w:rPr>
+                <w:rStyle w:val="VerbatimChar"/>
+              </w:rPr>
+              <w:t xml:space="preserve">FORMAT</w:t>
+            </w:r>
+            <w:r>
+              <w:t xml:space="preserve">, mặc định</w:t>
+            </w:r>
+            <w:r>
+              <w:t xml:space="preserve"> </w:t>
+            </w:r>
+            <w:r>
+              <w:rPr>
+                <w:rStyle w:val="VerbatimChar"/>
+              </w:rPr>
+              <w:t xml:space="preserve">COMMENT</w:t>
+            </w:r>
+            <w:r>
+              <w:t xml:space="preserve">),</w:t>
+            </w:r>
+            <w:r>
+              <w:t xml:space="preserve"> </w:t>
+            </w:r>
+            <w:r>
+              <w:rPr>
+                <w:rStyle w:val="VerbatimChar"/>
+              </w:rPr>
+              <w:t xml:space="preserve">suggestion</w:t>
+            </w:r>
+            <w:r>
+              <w:t xml:space="preserve"> </w:t>
+            </w:r>
+            <w:r>
+              <w:t xml:space="preserve">(gợi ý sửa),</w:t>
+            </w:r>
+            <w:r>
+              <w:t xml:space="preserve"> </w:t>
+            </w:r>
+            <w:r>
+              <w:rPr>
+                <w:rStyle w:val="VerbatimChar"/>
+              </w:rPr>
+              <w:t xml:space="preserve">section_key</w:t>
+            </w:r>
+            <w:r>
+              <w:t xml:space="preserve"> </w:t>
+            </w:r>
+            <w:r>
+              <w:t xml:space="preserve">(mục chứa đoạn),</w:t>
+            </w:r>
+            <w:r>
+              <w:t xml:space="preserve"> </w:t>
+            </w:r>
+            <w:r>
+              <w:rPr>
+                <w:rStyle w:val="VerbatimChar"/>
+              </w:rPr>
+              <w:t xml:space="preserve">resolved_at</w:t>
+            </w:r>
+            <w:r>
+              <w:t xml:space="preserve"> </w:t>
+            </w:r>
+            <w:r>
+              <w:t xml:space="preserve">+</w:t>
+            </w:r>
+            <w:r>
+              <w:t xml:space="preserve"> </w:t>
+            </w:r>
+            <w:r>
+              <w:rPr>
+                <w:rStyle w:val="VerbatimChar"/>
+              </w:rPr>
+              <w:t xml:space="preserve">resolved_by</w:t>
+            </w:r>
+            <w:r>
+              <w:t xml:space="preserve"> </w:t>
+            </w:r>
+            <w:r>
+              <w:t xml:space="preserve">(đã xử lý — CK: có người xử lý thì phải có thời điểm); xoá theo tài liệu. Đây là phản hồi hướng dẫn trong lúc viết, không phải điểm chấm bản nộp.</w:t>
             </w:r>
           </w:p>
         </w:tc>

</xml_diff>